<commit_message>
Refine the LDF alignment question
Co-Authored-By: Claude Fable 5.1 <noreply@anthropic.com>
Claude-Session: https://claude.ai/code/session_01LgFPs3fMSncBgbYQ3PfA3o
</commit_message>
<xml_diff>
--- a/output/ldf-alignment-design-note.docx
+++ b/output/ldf-alignment-design-note.docx
@@ -286,7 +286,7 @@
           <w:b/>
           <w:i w:val="false"/>
         </w:rPr>
-        <w:t>Does the Army's promotion and career-development continuum deliberately prepare, select and develop its people for the changes in leadership purpose, mindset, behaviours, scope and scale required at each LDF transition?</w:t>
+        <w:t>To what extent does the Army's promotion and career-development continuum deliberately develop its people for the changes in leadership required at each Leadership Development Framework transition?</w:t>
       </w:r>
     </w:p>
     <w:p>
@@ -2070,7 +2070,7 @@
           <w:b w:val="false"/>
           <w:i w:val="false"/>
         </w:rPr>
-        <w:t>Each row of the matrix is a transition: the current level, the developmental shift, and the new level. The row asks one question of each continuum: does the career system deliberately prepare the individual for this shift?</w:t>
+        <w:t>Each row of the matrix is a transition: the current level, the developmental shift, and the new level. The row asks one question of each continuum: to what extent does the career system deliberately develop the individual for this shift?</w:t>
       </w:r>
     </w:p>
     <w:p>
@@ -2350,7 +2350,7 @@
           <w:b w:val="false"/>
           <w:i w:val="false"/>
         </w:rPr>
-        <w:t>Every cell carries one of three states until the data is complete. The state is written in the cell as a short tag, so the matrix reads correctly in greyscale and colour is an addition rather than the carrier of meaning.</w:t>
+        <w:t>The question asks "to what extent", so the answer for each transition is a degree, read across the row as the balance of aligned cells, named gaps and unknowns, rather than a yes or no. Every cell carries one of three states until the data is complete. The state is written in the cell as a short tag, so the matrix reads correctly in greyscale and colour is an addition rather than the carrier of meaning.</w:t>
       </w:r>
     </w:p>
     <w:tbl>

</xml_diff>

<commit_message>
LDF alignment: adopt COMDT's framing for headline, test and closing
Co-Authored-By: Claude Fable 5.1 <noreply@anthropic.com>
Claude-Session: https://claude.ai/code/session_01LgFPs3fMSncBgbYQ3PfA3o
</commit_message>
<xml_diff>
--- a/output/ldf-alignment-design-note.docx
+++ b/output/ldf-alignment-design-note.docx
@@ -266,27 +266,302 @@
           <w:b w:val="false"/>
           <w:i w:val="false"/>
         </w:rPr>
-        <w:t>The question under test is:</w:t>
-      </w:r>
-    </w:p>
-    <w:p>
-      <w:pPr>
-        <w:pStyle w:val="Normal"/>
-        <w:pBdr>
-          <w:left w:val="single" w:sz="28" w:space="8" w:color="C62026"/>
-        </w:pBdr>
-        <w:shd w:val="clear" w:color="auto" w:fill="CDD2B7"/>
-        <w:spacing w:before="160" w:after="160"/>
-        <w:ind w:left="283" w:right="283"/>
-        <w:rPr/>
-      </w:pPr>
-      <w:r>
-        <w:rPr>
-          <w:rFonts w:cs="Arial"/>
-          <w:b/>
-          <w:i w:val="false"/>
-        </w:rPr>
-        <w:t>To what extent does the Army's promotion and career-development continuum deliberately develop its people for the changes in leadership required at each Leadership Development Framework transition?</w:t>
+        <w:t>The tasking from COMDT ACS is to consider how the Officer and Other Rank promotion continuums align with the intent and design of the LDF, present the facts, and challenge the organisation to decide about the development of leaders at all levels. The piece therefore carries three wordings, each with a fixed place.</w:t>
+      </w:r>
+    </w:p>
+    <w:tbl>
+      <w:tblPr>
+        <w:tblW w:w="9298" w:type="dxa"/>
+        <w:jc w:val="left"/>
+        <w:tblInd w:w="2" w:type="dxa"/>
+        <w:tblLayout w:type="fixed"/>
+        <w:tblCellMar>
+          <w:top w:w="60" w:type="dxa"/>
+          <w:left w:w="110" w:type="dxa"/>
+          <w:bottom w:w="60" w:type="dxa"/>
+          <w:right w:w="110" w:type="dxa"/>
+        </w:tblCellMar>
+        <w:tblLook w:val="04a0" w:noHBand="0" w:noVBand="1" w:firstColumn="1" w:lastRow="0" w:lastColumn="0" w:firstRow="1"/>
+      </w:tblPr>
+      <w:tblGrid>
+        <w:gridCol w:w="2608"/>
+        <w:gridCol w:w="6689"/>
+      </w:tblGrid>
+      <w:tr>
+        <w:trPr>
+          <w:cantSplit w:val="true"/>
+        </w:trPr>
+        <w:tc>
+          <w:tcPr>
+            <w:tcW w:w="2608" w:type="dxa"/>
+            <w:tcBorders>
+              <w:top w:val="single" w:sz="4" w:space="0" w:color="A89662"/>
+              <w:left w:val="single" w:sz="4" w:space="0" w:color="A89662"/>
+              <w:bottom w:val="single" w:sz="4" w:space="0" w:color="D9D9D2"/>
+              <w:right w:val="single" w:sz="4" w:space="0" w:color="D9D9D2"/>
+            </w:tcBorders>
+            <w:shd w:color="auto" w:fill="002516" w:val="clear"/>
+          </w:tcPr>
+          <w:p>
+            <w:pPr>
+              <w:pStyle w:val="Normal"/>
+              <w:keepNext w:val="true"/>
+              <w:spacing w:lineRule="auto" w:line="268" w:before="0" w:after="0"/>
+              <w:rPr/>
+            </w:pPr>
+            <w:r>
+              <w:rPr>
+                <w:rFonts w:cs="Arial"/>
+                <w:b/>
+                <w:i w:val="false"/>
+                <w:color w:val="FFFFFF"/>
+                <w:sz w:val="18"/>
+              </w:rPr>
+              <w:t>Place</w:t>
+            </w:r>
+          </w:p>
+        </w:tc>
+        <w:tc>
+          <w:tcPr>
+            <w:tcW w:w="6689" w:type="dxa"/>
+            <w:tcBorders>
+              <w:top w:val="single" w:sz="4" w:space="0" w:color="A89662"/>
+              <w:left w:val="single" w:sz="4" w:space="0" w:color="D9D9D2"/>
+              <w:bottom w:val="single" w:sz="4" w:space="0" w:color="D9D9D2"/>
+              <w:right w:val="single" w:sz="4" w:space="0" w:color="A89662"/>
+            </w:tcBorders>
+            <w:shd w:color="auto" w:fill="002516" w:val="clear"/>
+          </w:tcPr>
+          <w:p>
+            <w:pPr>
+              <w:pStyle w:val="Normal"/>
+              <w:keepNext w:val="true"/>
+              <w:spacing w:lineRule="auto" w:line="268" w:before="0" w:after="0"/>
+              <w:rPr/>
+            </w:pPr>
+            <w:r>
+              <w:rPr>
+                <w:rFonts w:cs="Arial"/>
+                <w:b/>
+                <w:i w:val="false"/>
+                <w:color w:val="FFFFFF"/>
+                <w:sz w:val="18"/>
+              </w:rPr>
+              <w:t>Wording</w:t>
+            </w:r>
+          </w:p>
+        </w:tc>
+      </w:tr>
+      <w:tr>
+        <w:trPr>
+          <w:cantSplit w:val="true"/>
+        </w:trPr>
+        <w:tc>
+          <w:tcPr>
+            <w:tcW w:w="2608" w:type="dxa"/>
+            <w:tcBorders>
+              <w:top w:val="single" w:sz="4" w:space="0" w:color="D9D9D2"/>
+              <w:left w:val="single" w:sz="4" w:space="0" w:color="A89662"/>
+              <w:bottom w:val="single" w:sz="4" w:space="0" w:color="D9D9D2"/>
+              <w:right w:val="single" w:sz="4" w:space="0" w:color="D9D9D2"/>
+            </w:tcBorders>
+            <w:shd w:color="auto" w:fill="CDD2B7" w:val="clear"/>
+          </w:tcPr>
+          <w:p>
+            <w:pPr>
+              <w:pStyle w:val="Normal"/>
+              <w:keepNext w:val="true"/>
+              <w:spacing w:lineRule="auto" w:line="268" w:before="0" w:after="0"/>
+              <w:rPr/>
+            </w:pPr>
+            <w:r>
+              <w:rPr>
+                <w:rFonts w:cs="Arial"/>
+                <w:b/>
+                <w:i w:val="false"/>
+                <w:color w:val="002516"/>
+                <w:sz w:val="18"/>
+              </w:rPr>
+              <w:t>Headline (page 1)</w:t>
+            </w:r>
+          </w:p>
+        </w:tc>
+        <w:tc>
+          <w:tcPr>
+            <w:tcW w:w="6689" w:type="dxa"/>
+            <w:tcBorders>
+              <w:top w:val="single" w:sz="4" w:space="0" w:color="D9D9D2"/>
+              <w:left w:val="single" w:sz="4" w:space="0" w:color="D9D9D2"/>
+              <w:bottom w:val="single" w:sz="4" w:space="0" w:color="D9D9D2"/>
+              <w:right w:val="single" w:sz="4" w:space="0" w:color="A89662"/>
+            </w:tcBorders>
+          </w:tcPr>
+          <w:p>
+            <w:pPr>
+              <w:pStyle w:val="Normal"/>
+              <w:keepNext w:val="true"/>
+              <w:spacing w:lineRule="auto" w:line="268" w:before="0" w:after="0"/>
+              <w:rPr/>
+            </w:pPr>
+            <w:r>
+              <w:rPr>
+                <w:rFonts w:cs="Arial"/>
+                <w:b w:val="false"/>
+                <w:i w:val="false"/>
+                <w:sz w:val="19"/>
+              </w:rPr>
+              <w:t>How well do the Army's Officer and Other Rank promotion continuums align with the intent and design of the LDF?</w:t>
+            </w:r>
+          </w:p>
+        </w:tc>
+      </w:tr>
+      <w:tr>
+        <w:trPr>
+          <w:cantSplit w:val="true"/>
+        </w:trPr>
+        <w:tc>
+          <w:tcPr>
+            <w:tcW w:w="2608" w:type="dxa"/>
+            <w:tcBorders>
+              <w:top w:val="single" w:sz="4" w:space="0" w:color="D9D9D2"/>
+              <w:left w:val="single" w:sz="4" w:space="0" w:color="A89662"/>
+              <w:bottom w:val="single" w:sz="4" w:space="0" w:color="D9D9D2"/>
+              <w:right w:val="single" w:sz="4" w:space="0" w:color="D9D9D2"/>
+            </w:tcBorders>
+            <w:shd w:color="auto" w:fill="CDD2B7" w:val="clear"/>
+          </w:tcPr>
+          <w:p>
+            <w:pPr>
+              <w:pStyle w:val="Normal"/>
+              <w:keepNext w:val="true"/>
+              <w:spacing w:lineRule="auto" w:line="268" w:before="0" w:after="0"/>
+              <w:rPr/>
+            </w:pPr>
+            <w:r>
+              <w:rPr>
+                <w:rFonts w:cs="Arial"/>
+                <w:b/>
+                <w:i w:val="false"/>
+                <w:color w:val="002516"/>
+                <w:sz w:val="18"/>
+              </w:rPr>
+              <w:t>Analytical test (pages 4 to 6)</w:t>
+            </w:r>
+          </w:p>
+        </w:tc>
+        <w:tc>
+          <w:tcPr>
+            <w:tcW w:w="6689" w:type="dxa"/>
+            <w:tcBorders>
+              <w:top w:val="single" w:sz="4" w:space="0" w:color="D9D9D2"/>
+              <w:left w:val="single" w:sz="4" w:space="0" w:color="D9D9D2"/>
+              <w:bottom w:val="single" w:sz="4" w:space="0" w:color="D9D9D2"/>
+              <w:right w:val="single" w:sz="4" w:space="0" w:color="A89662"/>
+            </w:tcBorders>
+          </w:tcPr>
+          <w:p>
+            <w:pPr>
+              <w:pStyle w:val="Normal"/>
+              <w:keepNext w:val="true"/>
+              <w:spacing w:lineRule="auto" w:line="268" w:before="0" w:after="0"/>
+              <w:rPr/>
+            </w:pPr>
+            <w:r>
+              <w:rPr>
+                <w:rFonts w:cs="Arial"/>
+                <w:b w:val="false"/>
+                <w:i w:val="false"/>
+                <w:sz w:val="19"/>
+              </w:rPr>
+              <w:t>At each LDF transition: does the continuum deliberately develop the individual for the change in leadership required, and is that development linked to promotion?</w:t>
+            </w:r>
+          </w:p>
+        </w:tc>
+      </w:tr>
+      <w:tr>
+        <w:trPr>
+          <w:cantSplit w:val="true"/>
+        </w:trPr>
+        <w:tc>
+          <w:tcPr>
+            <w:tcW w:w="2608" w:type="dxa"/>
+            <w:tcBorders>
+              <w:top w:val="single" w:sz="4" w:space="0" w:color="D9D9D2"/>
+              <w:left w:val="single" w:sz="4" w:space="0" w:color="A89662"/>
+              <w:bottom w:val="single" w:sz="4" w:space="0" w:color="A89662"/>
+              <w:right w:val="single" w:sz="4" w:space="0" w:color="D9D9D2"/>
+            </w:tcBorders>
+            <w:shd w:color="auto" w:fill="CDD2B7" w:val="clear"/>
+          </w:tcPr>
+          <w:p>
+            <w:pPr>
+              <w:pStyle w:val="Normal"/>
+              <w:spacing w:lineRule="auto" w:line="268" w:before="0" w:after="0"/>
+              <w:rPr/>
+            </w:pPr>
+            <w:r>
+              <w:rPr>
+                <w:rFonts w:cs="Arial"/>
+                <w:b/>
+                <w:i w:val="false"/>
+                <w:color w:val="002516"/>
+                <w:sz w:val="18"/>
+              </w:rPr>
+              <w:t>Closing (page 7)</w:t>
+            </w:r>
+          </w:p>
+        </w:tc>
+        <w:tc>
+          <w:tcPr>
+            <w:tcW w:w="6689" w:type="dxa"/>
+            <w:tcBorders>
+              <w:top w:val="single" w:sz="4" w:space="0" w:color="D9D9D2"/>
+              <w:left w:val="single" w:sz="4" w:space="0" w:color="D9D9D2"/>
+              <w:bottom w:val="single" w:sz="4" w:space="0" w:color="A89662"/>
+              <w:right w:val="single" w:sz="4" w:space="0" w:color="A89662"/>
+            </w:tcBorders>
+          </w:tcPr>
+          <w:p>
+            <w:pPr>
+              <w:pStyle w:val="Normal"/>
+              <w:spacing w:lineRule="auto" w:line="268" w:before="0" w:after="0"/>
+              <w:rPr/>
+            </w:pPr>
+            <w:r>
+              <w:rPr>
+                <w:rFonts w:cs="Arial"/>
+                <w:b w:val="false"/>
+                <w:i w:val="false"/>
+                <w:sz w:val="19"/>
+              </w:rPr>
+              <w:t>Given these facts, how should Army decide about the development of leaders at all levels?</w:t>
+            </w:r>
+          </w:p>
+        </w:tc>
+      </w:tr>
+    </w:tbl>
+    <w:p>
+      <w:pPr>
+        <w:pStyle w:val="Normal"/>
+        <w:spacing w:before="0" w:after="120"/>
+        <w:rPr/>
+      </w:pPr>
+      <w:r>
+        <w:rPr/>
+      </w:r>
+    </w:p>
+    <w:p>
+      <w:pPr>
+        <w:pStyle w:val="Normal"/>
+        <w:rPr/>
+      </w:pPr>
+      <w:r>
+        <w:rPr>
+          <w:rFonts w:cs="Arial"/>
+          <w:b w:val="false"/>
+          <w:i w:val="false"/>
+        </w:rPr>
+        <w:t>"LDF" is used throughout as COMDT's term for the NZDF Leadership Framework and Leadership Development System taken together, and is defined once on page 2.</w:t>
       </w:r>
     </w:p>
     <w:p>
@@ -2070,7 +2345,7 @@
           <w:b w:val="false"/>
           <w:i w:val="false"/>
         </w:rPr>
-        <w:t>Each row of the matrix is a transition: the current level, the developmental shift, and the new level. The row asks one question of each continuum: to what extent does the career system deliberately develop the individual for this shift?</w:t>
+        <w:t>Each row of the matrix is a transition: the current level, the developmental shift, and the new level. The row applies the analytical test to each continuum: does it deliberately develop the individual for this shift, and is that development linked to promotion?</w:t>
       </w:r>
     </w:p>
     <w:p>
@@ -2350,7 +2625,7 @@
           <w:b w:val="false"/>
           <w:i w:val="false"/>
         </w:rPr>
-        <w:t>The question asks "to what extent", so the answer for each transition is a degree, read across the row as the balance of aligned cells, named gaps and unknowns, rather than a yes or no. Every cell carries one of three states until the data is complete. The state is written in the cell as a short tag, so the matrix reads correctly in greyscale and colour is an addition rather than the carrier of meaning.</w:t>
+        <w:t>The headline asks "how well", so the answer for each transition is a degree, read across the row as the balance of aligned cells, named gaps and unknowns, rather than a yes or no. Every cell carries one of three states until the data is complete. The state is written in the cell as a short tag, so the matrix reads correctly in greyscale and colour is an addition rather than the carrier of meaning.</w:t>
       </w:r>
     </w:p>
     <w:tbl>
@@ -3304,7 +3579,7 @@
           <w:b w:val="false"/>
           <w:i w:val="false"/>
         </w:rPr>
-        <w:t xml:space="preserve"> Type only. One question, generous space, nothing competing. The reader should be able to repeat it afterwards.</w:t>
+        <w:t xml:space="preserve"> Type only. COMDT's question in his own terms, generous space, nothing competing. The reader should be able to repeat it afterwards.</w:t>
       </w:r>
     </w:p>
     <w:p>
@@ -3412,7 +3687,7 @@
           <w:b w:val="false"/>
           <w:i w:val="false"/>
         </w:rPr>
-        <w:t xml:space="preserve"> The centrepiece matrix. Dark spine, mirrored columns, status tags. Populated only with what the four sources support: the LDS delivery model per level and the rank estimate from the Leadership Levels poster, both tagged TO CONFIRM. Everything else is DATA REQUIRED.</w:t>
+        <w:t xml:space="preserve"> The centrepiece matrix, with the analytical test stated once above it. Dark spine, mirrored columns, status tags. Populated only with what the four sources support: the LDS delivery model per level and the rank estimate from the Leadership Levels poster, both tagged TO CONFIRM. Everything else is DATA REQUIRED.</w:t>
       </w:r>
     </w:p>
     <w:p>
@@ -3520,7 +3795,7 @@
           <w:b w:val="false"/>
           <w:i w:val="false"/>
         </w:rPr>
-        <w:t xml:space="preserve"> Type only again. The three levers AITC controls are named (promotion, appointment, professional development) with no option or recommendation attached.</w:t>
+        <w:t xml:space="preserve"> Type only again, in COMDT's words: given these facts, how should Army decide about the development of leaders at all levels? The three levers AITC controls are named (promotion, appointment, professional development) with no option or recommendation attached.</w:t>
       </w:r>
     </w:p>
     <w:p>
@@ -4174,7 +4449,7 @@
         <w:sz w:val="17"/>
         <w:rFonts w:cs="Arial"/>
       </w:rPr>
-      <w:t>5</w:t>
+      <w:t>6</w:t>
     </w:r>
     <w:r>
       <w:rPr>
@@ -4217,7 +4492,7 @@
         <w:sz w:val="17"/>
         <w:rFonts w:cs="Arial"/>
       </w:rPr>
-      <w:t>5</w:t>
+      <w:t>6</w:t>
     </w:r>
     <w:r>
       <w:rPr>
@@ -4298,7 +4573,7 @@
         <w:sz w:val="17"/>
         <w:rFonts w:cs="Arial"/>
       </w:rPr>
-      <w:t>5</w:t>
+      <w:t>6</w:t>
     </w:r>
     <w:r>
       <w:rPr>
@@ -4341,7 +4616,7 @@
         <w:sz w:val="17"/>
         <w:rFonts w:cs="Arial"/>
       </w:rPr>
-      <w:t>5</w:t>
+      <w:t>6</w:t>
     </w:r>
     <w:r>
       <w:rPr>

</xml_diff>

<commit_message>
LDF discussion piece: linkage scale and the officer hollow middle
Page 1 replaces the binary MANDATED? boxes with a career-linkage scale
(formally mandated, functionally required, expected, self-selected,
unconnected) and a four-segment meter per box, segments outlined where a
policy check is still owed. Page 2 is rebuilt as the officer development
gap: the continuum drawn horizontally in five stages with a band whose
thickness is the linkage level, so the waist at CAPT to MAJ is visible;
soldier strip for contrast; the mechanism statement; history as context;
COMDT's question with the revised IF NO wording.

Design note rewritten around the scale and the shape of the gap, with
the transcript named as the governing evidence base. Register category
Mandate becomes Career linkage (IDs -LINK) with the level recorded.

Co-Authored-By: Claude Fable 5.1 <noreply@anthropic.com>
Claude-Session: https://claude.ai/code/session_01LgFPs3fMSncBgbYQ3PfA3o
</commit_message>
<xml_diff>
--- a/output/ldf-alignment-design-note.docx
+++ b/output/ldf-alignment-design-note.docx
@@ -106,7 +106,7 @@
           <w:spacing w:val="30"/>
           <w:sz w:val="19"/>
         </w:rPr>
-        <w:t>AITC DISCUSSION PIECE, TWO PAGES PLUS A DETACHABLE FUTURE STATE: DESIGN DRAFT</w:t>
+        <w:t>AITC DISCUSSION PIECE, TWO PAGES PLUS A DETACHABLE FUTURE STATE: DESIGN DRAFT 3</w:t>
       </w:r>
     </w:p>
     <w:p>
@@ -266,7 +266,7 @@
           <w:b w:val="false"/>
           <w:i w:val="false"/>
         </w:rPr>
-        <w:t>Read against that, the issue is narrow:</w:t>
+        <w:t>The first design reduced the issue to a proposition: Army deliberately links leadership development and promotion within the Soldier continuum, and the equivalent relationship within the Officer continuum is less clear. On 9 September 2026 Mike and Dave walked each transition of both continuums. The transcript of that meeting is now the working evidence base; where it and the auto-generated meeting notes differ, the transcript governs. It broadly supports the proposition and gives a much better story.</w:t>
       </w:r>
     </w:p>
     <w:p>
@@ -286,7 +286,7 @@
           <w:b/>
           <w:i w:val="false"/>
         </w:rPr>
-        <w:t>Army applies a deliberate link between leadership development and promotion within the Soldier continuum. The equivalent relationship within the Officer continuum is less clear. Is this difference deliberate, and if so, why?</w:t>
+        <w:t>The Officer side is not simply "nothing is mandated". The link between development and the career transition runs on a spectrum, from formally mandated, through functionally required, to expected or self-selected, to unconnected. The Soldier continuum sits at the formal end for its lower transitions. The Officer continuum is strong at commissioning, weakest in the operational middle, and strong again at the top. Is that shape a conscious choice?</w:t>
       </w:r>
     </w:p>
     <w:p>
@@ -300,21 +300,7 @@
           <w:b w:val="false"/>
           <w:i w:val="false"/>
         </w:rPr>
-        <w:t>The earlier seven-page construct tested six categories at six transitions for two continuums. That was a diagnostic of the whole system. COMDT is asking a sharper question, so the product is reduced to two pages and the six-category matrix is withdrawn from the briefing product.</w:t>
-      </w:r>
-    </w:p>
-    <w:p>
-      <w:pPr>
-        <w:pStyle w:val="Normal"/>
-        <w:rPr/>
-      </w:pPr>
-      <w:r>
-        <w:rPr>
-          <w:rFonts w:cs="Arial"/>
-          <w:b w:val="false"/>
-          <w:i w:val="false"/>
-        </w:rPr>
-        <w:t>On 9 September 2026 Mike and Dave walked each transition of both continuums and recorded what is mandated, what is recommended, what is policed in function, and what history the decision-makers should have. That meeting is now the main source for the cells on page 1. Everything it stated is tagged STATED 9 SEP until it is checked against promotion policy and the promotion-course data sheets. The meeting also actioned a current-versus-desired mapping, which is carried as a detachable third page.</w:t>
+        <w:t>The seven-page diagnostic and its six-category matrix remain withdrawn. The product is two pages, with a detachable third page for the current-versus-desired mapping the meeting actioned.</w:t>
       </w:r>
     </w:p>
     <w:p>
@@ -500,7 +486,7 @@
                 <w:i w:val="false"/>
                 <w:sz w:val="18"/>
               </w:rPr>
-              <w:t>Show the asymmetry</w:t>
+              <w:t>Show the asymmetry on a scale, not as a binary</w:t>
             </w:r>
           </w:p>
         </w:tc>
@@ -527,7 +513,7 @@
                 <w:i w:val="false"/>
                 <w:sz w:val="18"/>
               </w:rPr>
-              <w:t>One visual. The LDF's seven levels as the spine. Officer continuum on the left, Soldier continuum on the right, each showing rank, the development intervention at that point, and whether it is mandated. Headline question above; the question for Army beneath.</w:t>
+              <w:t>One visual. The LDF's seven levels as the spine. Officer continuum on the left, Soldier continuum on the right. Each box gives the development at that transition, the career linkage state (formally mandated, functionally required, expected, self-selected, unconnected) and a four-segment meter, with segments outlined where a policy check is still owed. Headline question above; the question for Army beneath.</w:t>
             </w:r>
           </w:p>
         </w:tc>
@@ -561,7 +547,7 @@
                 <w:color w:val="002516"/>
                 <w:sz w:val="18"/>
               </w:rPr>
-              <w:t>2. The discrepancy</w:t>
+              <w:t>2. The officer development gap</w:t>
             </w:r>
           </w:p>
         </w:tc>
@@ -588,7 +574,7 @@
                 <w:i w:val="false"/>
                 <w:sz w:val="18"/>
               </w:rPr>
-              <w:t>Let the answer emerge, give the background, then pose the challenge</w:t>
+              <w:t>Show the shape of the gap, give the history, pose the challenge</w:t>
             </w:r>
           </w:p>
         </w:tc>
@@ -615,7 +601,7 @@
                 <w:i w:val="false"/>
                 <w:sz w:val="18"/>
               </w:rPr>
-              <w:t>Two flows with identical steps. Soldier: promotion point, development mandated in policy, development completed, promotion: a deliberate link. Officer: promotion point, development exists and is recommended, not in policy (policed in function at T2, self-selected from T3), promotion: an unclear link. A background strip: what has been tried, why it stalled, and the explanation offered at the meeting, marked as not established. Then: is this difference a conscious choice? If so, what is the rationale? If not, should Army apply a more consistent principle?</w:t>
+              <w:t>The officer continuum drawn horizontally in five stages: commissioning, LT to CAPT, CAPT to MAJ, MAJ to LTCOL, senior officer. A band whose thickness is the linkage level, so the waist at CAPT to MAJ is visible. The soldier continuum at the same transitions as a strip beneath, for contrast. The statement: the issue may not be an absence of development but the absence of a consistently deliberate mechanism. A history strip. Then COMDT's question, IF YES and IF NO, no recommendation.</w:t>
             </w:r>
           </w:p>
         </w:tc>
@@ -703,7 +689,7 @@
                 <w:i w:val="false"/>
                 <w:sz w:val="18"/>
               </w:rPr>
-              <w:t>One table: LDF transition, then for each continuum the rank, the course and who delivers it, the mandate now, and the desired mandate. Shaded cells are the change. Below it: what changes (a mandate written into promotion policy, ILD seats aligned to Army promotion timing, the officer window placed after unit experience) and what does not (no new courses, no new money). Tabled only if the room answers page 2 with "not a conscious choice".</w:t>
+              <w:t>One table: LDF transition, then for each continuum the rank, the course and who delivers it, the linkage now and the linkage desired. Shaded cells are the change. Beneath: what changes (the linkage written into promotion policy, ILD seats aligned to Army promotion timing, the officer window placed after unit experience) and what does not (no new courses, no new money). Tabled only if the room answers page 2 with "no".</w:t>
             </w:r>
           </w:p>
         </w:tc>
@@ -730,7 +716,7 @@
           <w:b w:val="false"/>
           <w:i w:val="false"/>
         </w:rPr>
-        <w:t>The three wordings are fixed:</w:t>
+        <w:t>The fixed wordings:</w:t>
       </w:r>
     </w:p>
     <w:tbl>
@@ -952,6 +938,69 @@
             <w:tcBorders>
               <w:top w:val="single" w:sz="4" w:space="0" w:color="D9D9D2"/>
               <w:left w:val="single" w:sz="4" w:space="0" w:color="A89662"/>
+              <w:bottom w:val="single" w:sz="4" w:space="0" w:color="D9D9D2"/>
+              <w:right w:val="single" w:sz="4" w:space="0" w:color="D9D9D2"/>
+            </w:tcBorders>
+            <w:shd w:color="auto" w:fill="CDD2B7" w:val="clear"/>
+          </w:tcPr>
+          <w:p>
+            <w:pPr>
+              <w:pStyle w:val="Normal"/>
+              <w:keepNext w:val="true"/>
+              <w:spacing w:lineRule="auto" w:line="268" w:before="0" w:after="0"/>
+              <w:rPr/>
+            </w:pPr>
+            <w:r>
+              <w:rPr>
+                <w:rFonts w:cs="Arial"/>
+                <w:b/>
+                <w:i w:val="false"/>
+                <w:color w:val="002516"/>
+                <w:sz w:val="18"/>
+              </w:rPr>
+              <w:t>Statement, page 2</w:t>
+            </w:r>
+          </w:p>
+        </w:tc>
+        <w:tc>
+          <w:tcPr>
+            <w:tcW w:w="6689" w:type="dxa"/>
+            <w:tcBorders>
+              <w:top w:val="single" w:sz="4" w:space="0" w:color="D9D9D2"/>
+              <w:left w:val="single" w:sz="4" w:space="0" w:color="D9D9D2"/>
+              <w:bottom w:val="single" w:sz="4" w:space="0" w:color="D9D9D2"/>
+              <w:right w:val="single" w:sz="4" w:space="0" w:color="A89662"/>
+            </w:tcBorders>
+          </w:tcPr>
+          <w:p>
+            <w:pPr>
+              <w:pStyle w:val="Normal"/>
+              <w:keepNext w:val="true"/>
+              <w:spacing w:lineRule="auto" w:line="268" w:before="0" w:after="0"/>
+              <w:rPr/>
+            </w:pPr>
+            <w:r>
+              <w:rPr>
+                <w:rFonts w:cs="Arial"/>
+                <w:b w:val="false"/>
+                <w:i w:val="false"/>
+                <w:sz w:val="19"/>
+              </w:rPr>
+              <w:t>The issue may not be an absence of leadership development. It is the absence of a consistently deliberate mechanism linking the right development to the right career transition.</w:t>
+            </w:r>
+          </w:p>
+        </w:tc>
+      </w:tr>
+      <w:tr>
+        <w:trPr>
+          <w:cantSplit w:val="true"/>
+        </w:trPr>
+        <w:tc>
+          <w:tcPr>
+            <w:tcW w:w="2608" w:type="dxa"/>
+            <w:tcBorders>
+              <w:top w:val="single" w:sz="4" w:space="0" w:color="D9D9D2"/>
+              <w:left w:val="single" w:sz="4" w:space="0" w:color="A89662"/>
               <w:bottom w:val="single" w:sz="4" w:space="0" w:color="A89662"/>
               <w:right w:val="single" w:sz="4" w:space="0" w:color="D9D9D2"/>
             </w:tcBorders>
@@ -998,7 +1047,7 @@
                 <w:i w:val="false"/>
                 <w:sz w:val="19"/>
               </w:rPr>
-              <w:t>Is this difference a conscious choice? If so, what is the rationale for treating Officer and Soldier leadership development differently? If not, should Army apply a more consistent principle to development before progression into increased leadership responsibility?</w:t>
+              <w:t>Is this a conscious choice? If yes, what is the rationale for treating Officer and Soldier leadership development differently? If no, should Army establish a more consistent mechanism for ensuring development occurs before increased leadership responsibility?</w:t>
             </w:r>
           </w:p>
         </w:tc>
@@ -1027,7 +1076,7 @@
           <w:color w:val="002516"/>
           <w:sz w:val="25"/>
         </w:rPr>
-        <w:t>3. Why the LDF Stays in the Middle</w:t>
+        <w:t>3. The Linkage Scale and the Shape of the Gap</w:t>
       </w:r>
     </w:p>
     <w:p>
@@ -1041,123 +1090,7 @@
           <w:b w:val="false"/>
           <w:i w:val="false"/>
         </w:rPr>
-        <w:t>The LDF is retained as the spine because it is the common reference that makes the comparison fair. Its levels describe progressively different leadership requirements: a genuine shift from effective individual contribution, to getting things done through others, through other leaders, to running a system, building capability, integrating at enterprise level, and stewarding the institution. Placing the two continuums against it allows one question to be asked at each transition: at the same developmental shift, what does Army require of a soldier, and what does it require of an officer?</w:t>
-      </w:r>
-    </w:p>
-    <w:p>
-      <w:pPr>
-        <w:pStyle w:val="Normal"/>
-        <w:rPr/>
-      </w:pPr>
-      <w:r>
-        <w:rPr>
-          <w:rFonts w:cs="Arial"/>
-          <w:b w:val="false"/>
-          <w:i w:val="false"/>
-        </w:rPr>
-        <w:t>Two points from the sources still govern how the spine is used.</w:t>
-      </w:r>
-    </w:p>
-    <w:p>
-      <w:pPr>
-        <w:pStyle w:val="Normal"/>
-        <w:tabs>
-          <w:tab w:val="clear" w:pos="720"/>
-          <w:tab w:val="left" w:pos="397" w:leader="none"/>
-        </w:tabs>
-        <w:spacing w:before="60" w:after="40"/>
-        <w:ind w:hanging="397" w:left="397"/>
-        <w:rPr/>
-      </w:pPr>
-      <w:r>
-        <w:rPr>
-          <w:rFonts w:cs="Arial"/>
-          <w:color w:val="000000"/>
-        </w:rPr>
-        <w:t>1.</w:t>
-        <w:tab/>
-      </w:r>
-      <w:r>
-        <w:rPr>
-          <w:rFonts w:cs="Arial"/>
-          <w:b/>
-          <w:i w:val="false"/>
-        </w:rPr>
-        <w:t>The rank mapping is an estimate.</w:t>
-      </w:r>
-      <w:r>
-        <w:rPr>
-          <w:rFonts w:cs="Arial"/>
-          <w:b w:val="false"/>
-          <w:i w:val="false"/>
-        </w:rPr>
-        <w:t xml:space="preserve"> The Leadership Levels poster says its alignment of rank to level is "only an estimation". Rank pairings on page 1 place the comparison; they do not assert that a rank equals a level. The page says so in one line.</w:t>
-      </w:r>
-    </w:p>
-    <w:p>
-      <w:pPr>
-        <w:pStyle w:val="Normal"/>
-        <w:tabs>
-          <w:tab w:val="clear" w:pos="720"/>
-          <w:tab w:val="left" w:pos="397" w:leader="none"/>
-        </w:tabs>
-        <w:spacing w:before="60" w:after="40"/>
-        <w:ind w:hanging="397" w:left="397"/>
-        <w:rPr/>
-      </w:pPr>
-      <w:r>
-        <w:rPr>
-          <w:rFonts w:cs="Arial"/>
-          <w:color w:val="000000"/>
-        </w:rPr>
-        <w:t>2.</w:t>
-        <w:tab/>
-      </w:r>
-      <w:r>
-        <w:rPr>
-          <w:rFonts w:cs="Arial"/>
-          <w:b/>
-          <w:i w:val="false"/>
-        </w:rPr>
-        <w:t>The LDS intends development before the transition.</w:t>
-      </w:r>
-      <w:r>
-        <w:rPr>
-          <w:rFonts w:cs="Arial"/>
-          <w:b w:val="false"/>
-          <w:i w:val="false"/>
-        </w:rPr>
-        <w:t xml:space="preserve"> The Leadership Development System places the LDS course in the Orientation phase, ideally about six months before the first posting to the new level. Whether Army's promotion courses achieve that for either continuum is part of what the facts must show.</w:t>
-      </w:r>
-    </w:p>
-    <w:p>
-      <w:pPr>
-        <w:pStyle w:val="Heading1"/>
-        <w:rPr/>
-      </w:pPr>
-      <w:r>
-        <w:rPr>
-          <w:rFonts w:cs="Arial"/>
-          <w:b/>
-          <w:i w:val="false"/>
-          <w:color w:val="002516"/>
-          <w:sz w:val="25"/>
-        </w:rPr>
-        <w:t>4. What Is Known and What Is Not</w:t>
-      </w:r>
-    </w:p>
-    <w:p>
-      <w:pPr>
-        <w:pStyle w:val="Normal"/>
-        <w:rPr/>
-      </w:pPr>
-      <w:r>
-        <w:rPr>
-          <w:rFonts w:cs="Arial"/>
-          <w:b w:val="false"/>
-          <w:i w:val="false"/>
-        </w:rPr>
-        <w:t>Populated cells on page 1 now rest on the 9 September meeting, read against the four source documents and the NZALC course data sheets. Ranks follow the meeting: WO2 is the Lead Systems tick and WO1 the Lead Capability tick.</w:t>
+        <w:t>The meeting made a binary comparison untenable. At the 2LT and LT to CAPT transition, Lead Leaders is not mandated in promotion policy, yet OCS and COs police it so that in practice no junior officer promotes without it. That is neither "mandated" nor "not mandated". The visual language therefore changes from MANDATED? YES / NO to a scale of career linkage:</w:t>
       </w:r>
     </w:p>
     <w:tbl>
@@ -1208,7 +1141,7 @@
                 <w:color w:val="FFFFFF"/>
                 <w:sz w:val="18"/>
               </w:rPr>
-              <w:t>Transition</w:t>
+              <w:t>Level</w:t>
             </w:r>
           </w:p>
         </w:tc>
@@ -1237,7 +1170,7 @@
                 <w:color w:val="FFFFFF"/>
                 <w:sz w:val="18"/>
               </w:rPr>
-              <w:t>Soldier</w:t>
+              <w:t>State</w:t>
             </w:r>
           </w:p>
         </w:tc>
@@ -1266,7 +1199,7 @@
                 <w:color w:val="FFFFFF"/>
                 <w:sz w:val="18"/>
               </w:rPr>
-              <w:t>Officer</w:t>
+              <w:t>Meaning</w:t>
             </w:r>
           </w:p>
         </w:tc>
@@ -1300,7 +1233,7 @@
                 <w:color w:val="002516"/>
                 <w:sz w:val="18"/>
               </w:rPr>
-              <w:t>Entry</w:t>
+              <w:t>4</w:t>
             </w:r>
           </w:p>
         </w:tc>
@@ -1327,7 +1260,7 @@
                 <w:i w:val="false"/>
                 <w:sz w:val="18"/>
               </w:rPr>
-              <w:t>Lead Self compulsory on entry, delivered through train-the-trainer (TAD, ACS)</w:t>
+              <w:t>Formally mandated</w:t>
             </w:r>
           </w:p>
         </w:tc>
@@ -1354,7 +1287,7 @@
                 <w:i w:val="false"/>
                 <w:sz w:val="18"/>
               </w:rPr>
-              <w:t>Lead Self compulsory, as for soldiers</w:t>
+              <w:t>In promotion policy, or embedded in the qualifying course so that qualifying on the course qualifies the leadership content</w:t>
             </w:r>
           </w:p>
         </w:tc>
@@ -1388,7 +1321,7 @@
                 <w:color w:val="002516"/>
                 <w:sz w:val="18"/>
               </w:rPr>
-              <w:t>T1 Lead Self to Lead Teams</w:t>
+              <w:t>3</w:t>
             </w:r>
           </w:p>
         </w:tc>
@@ -1415,7 +1348,7 @@
                 <w:i w:val="false"/>
                 <w:sz w:val="18"/>
               </w:rPr>
-              <w:t>PTE to LCPL. Mandated: ELDA Lead Teams (A18011) is embedded in the JNCO course (A1530) as the performance-under-pressure module, with LDS Lead Teams (D03020) sequenced alongside</w:t>
+              <w:t>Functionally required</w:t>
             </w:r>
           </w:p>
         </w:tc>
@@ -1442,7 +1375,7 @@
                 <w:i w:val="false"/>
                 <w:sz w:val="18"/>
               </w:rPr>
-              <w:t>OCDT to 2LT. Embedded: NZCC includes ELDA Lead Teams (the former Nemesis, rebranded with the same learning outcomes) and LDS Lead Teams, delivered by ALC at OCS in March, two years running</w:t>
+              <w:t>Not in policy, but policed as if it were</w:t>
             </w:r>
           </w:p>
         </w:tc>
@@ -1476,7 +1409,7 @@
                 <w:color w:val="002516"/>
                 <w:sz w:val="18"/>
               </w:rPr>
-              <w:t>T2 Lead Teams to Lead Leaders</w:t>
+              <w:t>2</w:t>
             </w:r>
           </w:p>
         </w:tc>
@@ -1503,7 +1436,7 @@
                 <w:i w:val="false"/>
                 <w:sz w:val="18"/>
               </w:rPr>
-              <w:t>CPL to SGT. Mandated in promotion policy: the SNCO course (A1531) carries ELDA Lead Leaders (A18008) and LDS Lead Leaders (D03030). "Very clear on the NCO front"</w:t>
+              <w:t>Expected</w:t>
             </w:r>
           </w:p>
         </w:tc>
@@ -1530,7 +1463,7 @@
                 <w:i w:val="false"/>
                 <w:sz w:val="18"/>
               </w:rPr>
-              <w:t>2LT and LT to CAPT. Recommended, not mandated: not in promotion policy, but policed in function by OCS and COs so that in practice no 2LT or LT promotes without it. "Super murky on the officer front". This is the substantive CAPT request</w:t>
+              <w:t>Self-selected, with high uptake</w:t>
             </w:r>
           </w:p>
         </w:tc>
@@ -1564,7 +1497,7 @@
                 <w:color w:val="002516"/>
                 <w:sz w:val="18"/>
               </w:rPr>
-              <w:t>T3 Lead Leaders to Lead Systems</w:t>
+              <w:t>1</w:t>
             </w:r>
           </w:p>
         </w:tc>
@@ -1591,7 +1524,7 @@
                 <w:i w:val="false"/>
                 <w:sz w:val="18"/>
               </w:rPr>
-              <w:t>SSGT to WO2. ELDA Lead Systems (A18010) mandated on the WO course (A1532). LDS Lead Systems is ILD-delivered and Army cannot guarantee seats, so it is routinely done before or after the promotion course. Whether it is a prerequisite for WO2 is Dave's action</w:t>
+              <w:t>Self-selected</w:t>
             </w:r>
           </w:p>
         </w:tc>
@@ -1618,7 +1551,7 @@
                 <w:i w:val="false"/>
                 <w:sz w:val="18"/>
               </w:rPr>
-              <w:t>CAPT to MAJ. Neither ELDA Lead Systems nor the ILD LDS Lead Systems course is mandated, and neither is policed in function. Uptake is self-selecting. CAPT to OC is the largest single jump in scope of influence</w:t>
+              <w:t>Uptake rests on individual inclination</w:t>
             </w:r>
           </w:p>
         </w:tc>
@@ -1633,7 +1566,7 @@
             <w:tcBorders>
               <w:top w:val="single" w:sz="4" w:space="0" w:color="D9D9D2"/>
               <w:left w:val="single" w:sz="4" w:space="0" w:color="A89662"/>
-              <w:bottom w:val="single" w:sz="4" w:space="0" w:color="D9D9D2"/>
+              <w:bottom w:val="single" w:sz="4" w:space="0" w:color="A89662"/>
               <w:right w:val="single" w:sz="4" w:space="0" w:color="D9D9D2"/>
             </w:tcBorders>
             <w:shd w:color="auto" w:fill="CDD2B7" w:val="clear"/>
@@ -1652,7 +1585,7 @@
                 <w:color w:val="002516"/>
                 <w:sz w:val="18"/>
               </w:rPr>
-              <w:t>T4 Lead Systems to Lead Capability</w:t>
+              <w:t>0</w:t>
             </w:r>
           </w:p>
         </w:tc>
@@ -1662,7 +1595,7 @@
             <w:tcBorders>
               <w:top w:val="single" w:sz="4" w:space="0" w:color="D9D9D2"/>
               <w:left w:val="single" w:sz="4" w:space="0" w:color="D9D9D2"/>
-              <w:bottom w:val="single" w:sz="4" w:space="0" w:color="D9D9D2"/>
+              <w:bottom w:val="single" w:sz="4" w:space="0" w:color="A89662"/>
               <w:right w:val="single" w:sz="4" w:space="0" w:color="D9D9D2"/>
             </w:tcBorders>
           </w:tcPr>
@@ -1679,183 +1612,7 @@
                 <w:i w:val="false"/>
                 <w:sz w:val="18"/>
               </w:rPr>
-              <w:t>WO2 to WO1. LDS Lead Capability (ILD). Expected for promotion; "pretty sure" not in policy. Most attend, subject to an ILD seat</w:t>
-            </w:r>
-          </w:p>
-        </w:tc>
-        <w:tc>
-          <w:tcPr>
-            <w:tcW w:w="3628" w:type="dxa"/>
-            <w:tcBorders>
-              <w:top w:val="single" w:sz="4" w:space="0" w:color="D9D9D2"/>
-              <w:left w:val="single" w:sz="4" w:space="0" w:color="D9D9D2"/>
-              <w:bottom w:val="single" w:sz="4" w:space="0" w:color="D9D9D2"/>
-              <w:right w:val="single" w:sz="4" w:space="0" w:color="A89662"/>
-            </w:tcBorders>
-          </w:tcPr>
-          <w:p>
-            <w:pPr>
-              <w:pStyle w:val="Normal"/>
-              <w:spacing w:lineRule="auto" w:line="268" w:before="0" w:after="0"/>
-              <w:rPr/>
-            </w:pPr>
-            <w:r>
-              <w:rPr>
-                <w:rFonts w:cs="Arial"/>
-                <w:b w:val="false"/>
-                <w:i w:val="false"/>
-                <w:sz w:val="18"/>
-              </w:rPr>
-              <w:t>MAJ to LTCOL. LDS Lead Capability (ILD). Not mandated; the impression is that all complete it</w:t>
-            </w:r>
-          </w:p>
-        </w:tc>
-      </w:tr>
-      <w:tr>
-        <w:trPr>
-          <w:cantSplit w:val="true"/>
-        </w:trPr>
-        <w:tc>
-          <w:tcPr>
-            <w:tcW w:w="2040" w:type="dxa"/>
-            <w:tcBorders>
-              <w:top w:val="single" w:sz="4" w:space="0" w:color="D9D9D2"/>
-              <w:left w:val="single" w:sz="4" w:space="0" w:color="A89662"/>
-              <w:bottom w:val="single" w:sz="4" w:space="0" w:color="D9D9D2"/>
-              <w:right w:val="single" w:sz="4" w:space="0" w:color="D9D9D2"/>
-            </w:tcBorders>
-            <w:shd w:color="auto" w:fill="CDD2B7" w:val="clear"/>
-          </w:tcPr>
-          <w:p>
-            <w:pPr>
-              <w:pStyle w:val="Normal"/>
-              <w:spacing w:lineRule="auto" w:line="268" w:before="0" w:after="0"/>
-              <w:rPr/>
-            </w:pPr>
-            <w:r>
-              <w:rPr>
-                <w:rFonts w:cs="Arial"/>
-                <w:b/>
-                <w:i w:val="false"/>
-                <w:color w:val="002516"/>
-                <w:sz w:val="18"/>
-              </w:rPr>
-              <w:t>T5 Lead Capability to Lead Integrated Capability</w:t>
-            </w:r>
-          </w:p>
-        </w:tc>
-        <w:tc>
-          <w:tcPr>
-            <w:tcW w:w="3629" w:type="dxa"/>
-            <w:tcBorders>
-              <w:top w:val="single" w:sz="4" w:space="0" w:color="D9D9D2"/>
-              <w:left w:val="single" w:sz="4" w:space="0" w:color="D9D9D2"/>
-              <w:bottom w:val="single" w:sz="4" w:space="0" w:color="D9D9D2"/>
-              <w:right w:val="single" w:sz="4" w:space="0" w:color="D9D9D2"/>
-            </w:tcBorders>
-          </w:tcPr>
-          <w:p>
-            <w:pPr>
-              <w:pStyle w:val="Normal"/>
-              <w:spacing w:lineRule="auto" w:line="268" w:before="0" w:after="0"/>
-              <w:rPr/>
-            </w:pPr>
-            <w:r>
-              <w:rPr>
-                <w:rFonts w:cs="Arial"/>
-                <w:b w:val="false"/>
-                <w:i w:val="false"/>
-                <w:sz w:val="18"/>
-              </w:rPr>
-              <w:t>WO1s. One ELDA week (ALC caving or Navy sailing) and one LDS week in Wellington, both run and funded by ILD. 12 to 16 students a course; attended without exception</w:t>
-            </w:r>
-          </w:p>
-        </w:tc>
-        <w:tc>
-          <w:tcPr>
-            <w:tcW w:w="3628" w:type="dxa"/>
-            <w:tcBorders>
-              <w:top w:val="single" w:sz="4" w:space="0" w:color="D9D9D2"/>
-              <w:left w:val="single" w:sz="4" w:space="0" w:color="D9D9D2"/>
-              <w:bottom w:val="single" w:sz="4" w:space="0" w:color="D9D9D2"/>
-              <w:right w:val="single" w:sz="4" w:space="0" w:color="A89662"/>
-            </w:tcBorders>
-          </w:tcPr>
-          <w:p>
-            <w:pPr>
-              <w:pStyle w:val="Normal"/>
-              <w:spacing w:lineRule="auto" w:line="268" w:before="0" w:after="0"/>
-              <w:rPr/>
-            </w:pPr>
-            <w:r>
-              <w:rPr>
-                <w:rFonts w:cs="Arial"/>
-                <w:b w:val="false"/>
-                <w:i w:val="false"/>
-                <w:sz w:val="18"/>
-              </w:rPr>
-              <w:t>LTCOL and COL. The same course; attended without exception</w:t>
-            </w:r>
-          </w:p>
-        </w:tc>
-      </w:tr>
-      <w:tr>
-        <w:trPr>
-          <w:cantSplit w:val="true"/>
-        </w:trPr>
-        <w:tc>
-          <w:tcPr>
-            <w:tcW w:w="2040" w:type="dxa"/>
-            <w:tcBorders>
-              <w:top w:val="single" w:sz="4" w:space="0" w:color="D9D9D2"/>
-              <w:left w:val="single" w:sz="4" w:space="0" w:color="A89662"/>
-              <w:bottom w:val="single" w:sz="4" w:space="0" w:color="A89662"/>
-              <w:right w:val="single" w:sz="4" w:space="0" w:color="D9D9D2"/>
-            </w:tcBorders>
-            <w:shd w:color="auto" w:fill="CDD2B7" w:val="clear"/>
-          </w:tcPr>
-          <w:p>
-            <w:pPr>
-              <w:pStyle w:val="Normal"/>
-              <w:spacing w:lineRule="auto" w:line="268" w:before="0" w:after="0"/>
-              <w:rPr/>
-            </w:pPr>
-            <w:r>
-              <w:rPr>
-                <w:rFonts w:cs="Arial"/>
-                <w:b/>
-                <w:i w:val="false"/>
-                <w:color w:val="002516"/>
-                <w:sz w:val="18"/>
-              </w:rPr>
-              <w:t>T6 Lead Integrated Capability to Lead Organisation</w:t>
-            </w:r>
-          </w:p>
-        </w:tc>
-        <w:tc>
-          <w:tcPr>
-            <w:tcW w:w="3629" w:type="dxa"/>
-            <w:tcBorders>
-              <w:top w:val="single" w:sz="4" w:space="0" w:color="D9D9D2"/>
-              <w:left w:val="single" w:sz="4" w:space="0" w:color="D9D9D2"/>
-              <w:bottom w:val="single" w:sz="4" w:space="0" w:color="A89662"/>
-              <w:right w:val="single" w:sz="4" w:space="0" w:color="D9D9D2"/>
-            </w:tcBorders>
-          </w:tcPr>
-          <w:p>
-            <w:pPr>
-              <w:pStyle w:val="Normal"/>
-              <w:spacing w:lineRule="auto" w:line="268" w:before="0" w:after="0"/>
-              <w:rPr/>
-            </w:pPr>
-            <w:r>
-              <w:rPr>
-                <w:rFonts w:cs="Arial"/>
-                <w:b w:val="false"/>
-                <w:i w:val="false"/>
-                <w:sz w:val="18"/>
-              </w:rPr>
-              <w:t>Senior WO1s considered for the senior appointments. LDS Lead Organisation with an ELDA component (retreat setting, equine behaviour, psychometric profiling, external facilitation); all complete it well before they need to</w:t>
+              <w:t>Unconnected</w:t>
             </w:r>
           </w:p>
         </w:tc>
@@ -1882,7 +1639,7 @@
                 <w:i w:val="false"/>
                 <w:sz w:val="18"/>
               </w:rPr>
-              <w:t>COL and BRIG. The same course; all complete it well before required</w:t>
+              <w:t>No link between the development and the transition</w:t>
             </w:r>
           </w:p>
         </w:tc>
@@ -1909,7 +1666,65 @@
           <w:b w:val="false"/>
           <w:i w:val="false"/>
         </w:rPr>
-        <w:t>Two structural facts from the meeting shape the reading of the table.</w:t>
+        <w:t>Read on that scale, the officer continuum has a shape. Commissioning is structured: Lead Teams is embedded in NZCC. LT to CAPT is functionally enforced but not policy-embedded. CAPT to MAJ is the weakest point: neither ELDA nor LDS Lead Systems is mandated or policed, uptake rests on inclination, and it is the transition at which scope of influence grows most, from platoon to OC. From MAJ to LTCOL participation strengthens, and at LTCOL and above it is near-universal, because those officers are selected, scrutinised and career-conscious. Dave called the middle the grey zone: the officers doing the practical enabling and leading of Army, without the same systematic training link.</w:t>
+      </w:r>
+    </w:p>
+    <w:p>
+      <w:pPr>
+        <w:pStyle w:val="Normal"/>
+        <w:rPr/>
+      </w:pPr>
+      <w:r>
+        <w:rPr>
+          <w:rFonts w:cs="Arial"/>
+          <w:b w:val="false"/>
+          <w:i w:val="false"/>
+        </w:rPr>
+        <w:t>That is the core organisational insight, and page 2 is built on it. The problem is not soldiers developed and officers not. It is junior development, a hollow operational middle, and strong participation again at senior level. Strong participation at the top may also explain why senior leaders assume the same development is happening throughout Army.</w:t>
+      </w:r>
+    </w:p>
+    <w:p>
+      <w:pPr>
+        <w:pStyle w:val="Heading1"/>
+        <w:rPr/>
+      </w:pPr>
+      <w:r>
+        <w:rPr>
+          <w:rFonts w:cs="Arial"/>
+          <w:b/>
+          <w:i w:val="false"/>
+          <w:color w:val="002516"/>
+          <w:sz w:val="25"/>
+        </w:rPr>
+        <w:t>4. Why the LDF Stays in the Middle</w:t>
+      </w:r>
+    </w:p>
+    <w:p>
+      <w:pPr>
+        <w:pStyle w:val="Normal"/>
+        <w:rPr/>
+      </w:pPr>
+      <w:r>
+        <w:rPr>
+          <w:rFonts w:cs="Arial"/>
+          <w:b w:val="false"/>
+          <w:i w:val="false"/>
+        </w:rPr>
+        <w:t>The LDF is retained as the spine because it is the common reference that makes the comparison fair. Its levels describe progressively different leadership requirements. Placing the two continuums against it allows one question to be asked at each transition: at the same developmental shift, what does Army require of a soldier, and what does it require of an officer?</w:t>
+      </w:r>
+    </w:p>
+    <w:p>
+      <w:pPr>
+        <w:pStyle w:val="Normal"/>
+        <w:rPr/>
+      </w:pPr>
+      <w:r>
+        <w:rPr>
+          <w:rFonts w:cs="Arial"/>
+          <w:b w:val="false"/>
+          <w:i w:val="false"/>
+        </w:rPr>
+        <w:t>Two points still govern how the spine is used.</w:t>
       </w:r>
     </w:p>
     <w:p>
@@ -1937,7 +1752,7 @@
           <w:b/>
           <w:i w:val="false"/>
         </w:rPr>
-        <w:t>The 2012 division of delivery.</w:t>
+        <w:t>The rank mapping is an estimate.</w:t>
       </w:r>
       <w:r>
         <w:rPr>
@@ -1945,7 +1760,7 @@
           <w:b w:val="false"/>
           <w:i w:val="false"/>
         </w:rPr>
-        <w:t xml:space="preserve"> Single-Service providers train Lead Self to Lead Leaders, which covers most of the organisation. ILD trains Lead Systems and above for all three Services, and Army retains the ELDA function at those levels. Army therefore cannot guarantee an ILD seat, which is why LDS Lead Systems sits outside the WO promotion course and why a mandate above T2 is harder to enforce on either continuum.</w:t>
+        <w:t xml:space="preserve"> The Leadership Levels poster says its alignment of rank to level is "only an estimation". Rank pairings on page 1 now follow the meeting (WO2 is the Lead Systems tick, WO1 the Lead Capability tick) and place the comparison; they do not assert that a rank equals a level.</w:t>
       </w:r>
     </w:p>
     <w:p>
@@ -1973,7 +1788,7 @@
           <w:b/>
           <w:i w:val="false"/>
         </w:rPr>
-        <w:t>Where the gap bites.</w:t>
+        <w:t>The LDS intends development before the transition.</w:t>
       </w:r>
       <w:r>
         <w:rPr>
@@ -1981,7 +1796,23 @@
           <w:b w:val="false"/>
           <w:i w:val="false"/>
         </w:rPr>
-        <w:t xml:space="preserve"> Attendance is near-universal at LTCOL and above and at WO1 and above, because those groups are selected, scrutinised and ambitious. The formative years in unit, 2LT to MAJ, are where leadership development is missed, and where the promotion policy carries no marker.</w:t>
+        <w:t xml:space="preserve"> The Leadership Development System places the LDS course in the Orientation phase, ideally about six months before the first posting to the new level. The meeting adds that timing is critical for officers: Lead Leaders at OCS or on commissioning was the wrong time, and the aim is to capture officers with a couple of years of unit experience.</w:t>
+      </w:r>
+    </w:p>
+    <w:p>
+      <w:pPr>
+        <w:pStyle w:val="Heading1"/>
+        <w:rPr/>
+      </w:pPr>
+      <w:r>
+        <w:rPr>
+          <w:rFonts w:cs="Arial"/>
+          <w:b/>
+          <w:i w:val="false"/>
+          <w:color w:val="002516"/>
+          <w:sz w:val="25"/>
+        </w:rPr>
+        <w:t>5. What Is Known and What Is Not</w:t>
       </w:r>
     </w:p>
     <w:p>
@@ -1995,219 +1826,7 @@
           <w:b w:val="false"/>
           <w:i w:val="false"/>
         </w:rPr>
-        <w:t>The background the decision-makers should have, carried on page 2, is also from the meeting: a two-year pilot attaching Lead Leaders to Grade 2 and 3 coursing was withdrawn as untenable time away from units; a distributed, self-scheduled approach was agreed instead; the Post Commissioning Programme delivered Lead Leaders to every junior officer but before unit experience; AITC agreed in principle that officers should complete it and the proposal was parked in a headquarters restructure; and ACS was not at the table for later course redesigns.</w:t>
-      </w:r>
-    </w:p>
-    <w:p>
-      <w:pPr>
-        <w:pStyle w:val="Normal"/>
-        <w:rPr/>
-      </w:pPr>
-      <w:r>
-        <w:rPr>
-          <w:rFonts w:cs="Arial"/>
-          <w:b w:val="false"/>
-          <w:i w:val="false"/>
-        </w:rPr>
-        <w:t>Dave's own answer to COMDT's question, offered at the meeting and shown on page 2 as a candidate rather than a finding, was "a scheduling oversight in the face of tempo": training that is not required is the training that gets bumped.</w:t>
-      </w:r>
-    </w:p>
-    <w:p>
-      <w:pPr>
-        <w:pStyle w:val="Normal"/>
-        <w:rPr/>
-      </w:pPr>
-      <w:r>
-        <w:rPr>
-          <w:rFonts w:cs="Arial"/>
-          <w:b w:val="false"/>
-          <w:i w:val="false"/>
-        </w:rPr>
-        <w:t>The facts still required are the same three for every transition on each side, and are listed in the accompanying register:</w:t>
-      </w:r>
-    </w:p>
-    <w:p>
-      <w:pPr>
-        <w:pStyle w:val="Normal"/>
-        <w:tabs>
-          <w:tab w:val="clear" w:pos="720"/>
-          <w:tab w:val="left" w:pos="397" w:leader="none"/>
-        </w:tabs>
-        <w:spacing w:before="60" w:after="40"/>
-        <w:ind w:hanging="397" w:left="397"/>
-        <w:rPr/>
-      </w:pPr>
-      <w:r>
-        <w:rPr>
-          <w:rFonts w:cs="Arial"/>
-          <w:color w:val="000000"/>
-        </w:rPr>
-        <w:t>1.</w:t>
-        <w:tab/>
-      </w:r>
-      <w:r>
-        <w:rPr>
-          <w:rFonts w:cs="Arial"/>
-          <w:b/>
-          <w:i w:val="false"/>
-        </w:rPr>
-        <w:t>Promotion point.</w:t>
-      </w:r>
-      <w:r>
-        <w:rPr>
-          <w:rFonts w:cs="Arial"/>
-          <w:b w:val="false"/>
-          <w:i w:val="false"/>
-        </w:rPr>
-        <w:t xml:space="preserve"> The authoritative Army promotion or career point that corresponds to the transition.</w:t>
-      </w:r>
-    </w:p>
-    <w:p>
-      <w:pPr>
-        <w:pStyle w:val="Normal"/>
-        <w:tabs>
-          <w:tab w:val="clear" w:pos="720"/>
-          <w:tab w:val="left" w:pos="397" w:leader="none"/>
-        </w:tabs>
-        <w:spacing w:before="60" w:after="40"/>
-        <w:ind w:hanging="397" w:left="397"/>
-        <w:rPr/>
-      </w:pPr>
-      <w:r>
-        <w:rPr>
-          <w:rFonts w:cs="Arial"/>
-          <w:color w:val="000000"/>
-        </w:rPr>
-        <w:t>2.</w:t>
-        <w:tab/>
-      </w:r>
-      <w:r>
-        <w:rPr>
-          <w:rFonts w:cs="Arial"/>
-          <w:b/>
-          <w:i w:val="false"/>
-        </w:rPr>
-        <w:t>Development intervention.</w:t>
-      </w:r>
-      <w:r>
-        <w:rPr>
-          <w:rFonts w:cs="Arial"/>
-          <w:b w:val="false"/>
-          <w:i w:val="false"/>
-        </w:rPr>
-        <w:t xml:space="preserve"> The course or programme that develops the individual for that transition, with its SOLO code.</w:t>
-      </w:r>
-    </w:p>
-    <w:p>
-      <w:pPr>
-        <w:pStyle w:val="Normal"/>
-        <w:tabs>
-          <w:tab w:val="clear" w:pos="720"/>
-          <w:tab w:val="left" w:pos="397" w:leader="none"/>
-        </w:tabs>
-        <w:spacing w:before="60" w:after="40"/>
-        <w:ind w:hanging="397" w:left="397"/>
-        <w:rPr/>
-      </w:pPr>
-      <w:r>
-        <w:rPr>
-          <w:rFonts w:cs="Arial"/>
-          <w:color w:val="000000"/>
-        </w:rPr>
-        <w:t>3.</w:t>
-        <w:tab/>
-      </w:r>
-      <w:r>
-        <w:rPr>
-          <w:rFonts w:cs="Arial"/>
-          <w:b/>
-          <w:i w:val="false"/>
-        </w:rPr>
-        <w:t>Mandate.</w:t>
-      </w:r>
-      <w:r>
-        <w:rPr>
-          <w:rFonts w:cs="Arial"/>
-          <w:b w:val="false"/>
-          <w:i w:val="false"/>
-        </w:rPr>
-        <w:t xml:space="preserve"> Whether that development is a prerequisite for promotion, embedded in the promotion course, expected but not mandatory, or unconnected. For the officer side at T2 to T4 this is now a check of promotion policy against what the meeting stated, not an open question.</w:t>
-      </w:r>
-    </w:p>
-    <w:p>
-      <w:pPr>
-        <w:pStyle w:val="Heading1"/>
-        <w:rPr/>
-      </w:pPr>
-      <w:r>
-        <w:rPr>
-          <w:rFonts w:cs="Arial"/>
-          <w:b/>
-          <w:i w:val="false"/>
-          <w:color w:val="002516"/>
-          <w:sz w:val="25"/>
-        </w:rPr>
-        <w:t>5. Tone</w:t>
-      </w:r>
-    </w:p>
-    <w:p>
-      <w:pPr>
-        <w:pStyle w:val="Normal"/>
-        <w:rPr/>
-      </w:pPr>
-      <w:r>
-        <w:rPr>
-          <w:rFonts w:cs="Arial"/>
-          <w:b w:val="false"/>
-          <w:i w:val="false"/>
-        </w:rPr>
-        <w:t>The piece does not set out to prove the Officer system wrong. COMDT's posture is the intellectual stance: are we consciously choosing to deviate from best practice, and if so, why? There may be a defensible reason for treating Officer development differently. The job of the two pages is to expose the difference clearly enough that Army has to articulate that reason, or decide to change. Both branches of the closing question are given equal weight, and no recommendation is attached.</w:t>
-      </w:r>
-    </w:p>
-    <w:p>
-      <w:pPr>
-        <w:pStyle w:val="Heading1"/>
-        <w:rPr/>
-      </w:pPr>
-      <w:r>
-        <w:rPr>
-          <w:rFonts w:cs="Arial"/>
-          <w:b/>
-          <w:i w:val="false"/>
-          <w:color w:val="002516"/>
-          <w:sz w:val="25"/>
-        </w:rPr>
-        <w:t>6. What Has Been Withdrawn</w:t>
-      </w:r>
-    </w:p>
-    <w:p>
-      <w:pPr>
-        <w:pStyle w:val="Normal"/>
-        <w:rPr/>
-      </w:pPr>
-      <w:r>
-        <w:rPr>
-          <w:rFonts w:cs="Arial"/>
-          <w:b w:val="false"/>
-          <w:i w:val="false"/>
-        </w:rPr>
-        <w:t>The six-category matrix (rank, appointment, development, career linkage, timing, assurance), the gap taxonomy, and the seven-page sequence remain in the repository history as analytical scaffolding. They are not part of the briefing product. If AITC asks for the fuller diagnostic after the discussion, they can be revived from the retained data register without redesign.</w:t>
-      </w:r>
-    </w:p>
-    <w:p>
-      <w:pPr>
-        <w:pStyle w:val="Heading1"/>
-        <w:rPr/>
-      </w:pPr>
-      <w:r>
-        <w:rPr>
-          <w:rFonts w:cs="Arial"/>
-          <w:b/>
-          <w:i w:val="false"/>
-          <w:color w:val="002516"/>
-          <w:sz w:val="25"/>
-        </w:rPr>
-        <w:t>7. Actions From the 9 September Meeting</w:t>
+        <w:t>Populated cells on page 1 rest on the 9 September transcript, read against the four source documents and the NZALC course data sheets. STATED 9 SEP marks a statement from the meeting not yet verified; TO CONFIRM marks a cell where a policy check is owed before the state can stand.</w:t>
       </w:r>
     </w:p>
     <w:tbl>
@@ -2258,7 +1877,7 @@
                 <w:color w:val="FFFFFF"/>
                 <w:sz w:val="18"/>
               </w:rPr>
-              <w:t>Action</w:t>
+              <w:t>Transition</w:t>
             </w:r>
           </w:p>
         </w:tc>
@@ -2287,7 +1906,7 @@
                 <w:color w:val="FFFFFF"/>
                 <w:sz w:val="18"/>
               </w:rPr>
-              <w:t>Owner</w:t>
+              <w:t>Soldier</w:t>
             </w:r>
           </w:p>
         </w:tc>
@@ -2316,7 +1935,7 @@
                 <w:color w:val="FFFFFF"/>
                 <w:sz w:val="18"/>
               </w:rPr>
-              <w:t>Where it lands in this product</w:t>
+              <w:t>Officer</w:t>
             </w:r>
           </w:p>
         </w:tc>
@@ -2350,7 +1969,7 @@
                 <w:color w:val="002516"/>
                 <w:sz w:val="18"/>
               </w:rPr>
-              <w:t>Verify whether the ILD LDS Lead Systems course is a prerequisite in the promotion-course data sheet for SSGT to WO2</w:t>
+              <w:t>Entry</w:t>
             </w:r>
           </w:p>
         </w:tc>
@@ -2377,7 +1996,7 @@
                 <w:i w:val="false"/>
                 <w:sz w:val="18"/>
               </w:rPr>
-              <w:t>Dave</w:t>
+              <w:t>Lead Self compulsory on entry, delivered through train-the-trainer (TAD, ACS)</w:t>
             </w:r>
           </w:p>
         </w:tc>
@@ -2404,7 +2023,7 @@
                 <w:i w:val="false"/>
                 <w:sz w:val="18"/>
               </w:rPr>
-              <w:t>Page 1, soldier T3; register row T3-R-MAND</w:t>
+              <w:t>Lead Self compulsory, as for soldiers</w:t>
             </w:r>
           </w:p>
         </w:tc>
@@ -2438,7 +2057,7 @@
                 <w:color w:val="002516"/>
                 <w:sz w:val="18"/>
               </w:rPr>
-              <w:t>Check officer promotion requirements in policy for leadership training mandates at each rank</w:t>
+              <w:t>T1 Lead Self to Lead Teams</w:t>
             </w:r>
           </w:p>
         </w:tc>
@@ -2465,7 +2084,7 @@
                 <w:i w:val="false"/>
                 <w:sz w:val="18"/>
               </w:rPr>
-              <w:t>Team</w:t>
+              <w:t>PTE to LCPL. Formally mandated: ELDA Lead Teams (A18011) and LDS Lead Teams (D03020) inside the JNCO course (A1530)</w:t>
             </w:r>
           </w:p>
         </w:tc>
@@ -2492,7 +2111,7 @@
                 <w:i w:val="false"/>
                 <w:sz w:val="18"/>
               </w:rPr>
-              <w:t>Page 1, officer T2 to T6; register rows T2-O-MAND to T6-O-MAND, and X1</w:t>
+              <w:t>OCDT to 2LT. Formally mandated through NZCC: ELDA Lead Teams (the former Nemesis, rebranded with the same learning outcomes) and LDS Lead Teams, delivered by ALC at OCS in March, two years running</w:t>
             </w:r>
           </w:p>
         </w:tc>
@@ -2526,6 +2145,1042 @@
                 <w:color w:val="002516"/>
                 <w:sz w:val="18"/>
               </w:rPr>
+              <w:t>T2 Lead Teams to Lead Leaders</w:t>
+            </w:r>
+          </w:p>
+        </w:tc>
+        <w:tc>
+          <w:tcPr>
+            <w:tcW w:w="3629" w:type="dxa"/>
+            <w:tcBorders>
+              <w:top w:val="single" w:sz="4" w:space="0" w:color="D9D9D2"/>
+              <w:left w:val="single" w:sz="4" w:space="0" w:color="D9D9D2"/>
+              <w:bottom w:val="single" w:sz="4" w:space="0" w:color="D9D9D2"/>
+              <w:right w:val="single" w:sz="4" w:space="0" w:color="D9D9D2"/>
+            </w:tcBorders>
+          </w:tcPr>
+          <w:p>
+            <w:pPr>
+              <w:pStyle w:val="Normal"/>
+              <w:spacing w:lineRule="auto" w:line="268" w:before="0" w:after="0"/>
+              <w:rPr/>
+            </w:pPr>
+            <w:r>
+              <w:rPr>
+                <w:rFonts w:cs="Arial"/>
+                <w:b w:val="false"/>
+                <w:i w:val="false"/>
+                <w:sz w:val="18"/>
+              </w:rPr>
+              <w:t>CPL to SGT. Formally mandated: the SNCO course (A1531) carries ELDA Lead Leaders (A18008) and LDS Lead Leaders (D03030). "Very clear on the NCO front"</w:t>
+            </w:r>
+          </w:p>
+        </w:tc>
+        <w:tc>
+          <w:tcPr>
+            <w:tcW w:w="3628" w:type="dxa"/>
+            <w:tcBorders>
+              <w:top w:val="single" w:sz="4" w:space="0" w:color="D9D9D2"/>
+              <w:left w:val="single" w:sz="4" w:space="0" w:color="D9D9D2"/>
+              <w:bottom w:val="single" w:sz="4" w:space="0" w:color="D9D9D2"/>
+              <w:right w:val="single" w:sz="4" w:space="0" w:color="A89662"/>
+            </w:tcBorders>
+          </w:tcPr>
+          <w:p>
+            <w:pPr>
+              <w:pStyle w:val="Normal"/>
+              <w:spacing w:lineRule="auto" w:line="268" w:before="0" w:after="0"/>
+              <w:rPr/>
+            </w:pPr>
+            <w:r>
+              <w:rPr>
+                <w:rFonts w:cs="Arial"/>
+                <w:b w:val="false"/>
+                <w:i w:val="false"/>
+                <w:sz w:val="18"/>
+              </w:rPr>
+              <w:t>2LT and LT to CAPT. Functionally required: not in promotion policy, but policed by OCS and COs. "Super murky on the officer front". The substantive CAPT request. TO CONFIRM against policy</w:t>
+            </w:r>
+          </w:p>
+        </w:tc>
+      </w:tr>
+      <w:tr>
+        <w:trPr>
+          <w:cantSplit w:val="true"/>
+        </w:trPr>
+        <w:tc>
+          <w:tcPr>
+            <w:tcW w:w="2040" w:type="dxa"/>
+            <w:tcBorders>
+              <w:top w:val="single" w:sz="4" w:space="0" w:color="D9D9D2"/>
+              <w:left w:val="single" w:sz="4" w:space="0" w:color="A89662"/>
+              <w:bottom w:val="single" w:sz="4" w:space="0" w:color="D9D9D2"/>
+              <w:right w:val="single" w:sz="4" w:space="0" w:color="D9D9D2"/>
+            </w:tcBorders>
+            <w:shd w:color="auto" w:fill="CDD2B7" w:val="clear"/>
+          </w:tcPr>
+          <w:p>
+            <w:pPr>
+              <w:pStyle w:val="Normal"/>
+              <w:spacing w:lineRule="auto" w:line="268" w:before="0" w:after="0"/>
+              <w:rPr/>
+            </w:pPr>
+            <w:r>
+              <w:rPr>
+                <w:rFonts w:cs="Arial"/>
+                <w:b/>
+                <w:i w:val="false"/>
+                <w:color w:val="002516"/>
+                <w:sz w:val="18"/>
+              </w:rPr>
+              <w:t>T3 Lead Leaders to Lead Systems</w:t>
+            </w:r>
+          </w:p>
+        </w:tc>
+        <w:tc>
+          <w:tcPr>
+            <w:tcW w:w="3629" w:type="dxa"/>
+            <w:tcBorders>
+              <w:top w:val="single" w:sz="4" w:space="0" w:color="D9D9D2"/>
+              <w:left w:val="single" w:sz="4" w:space="0" w:color="D9D9D2"/>
+              <w:bottom w:val="single" w:sz="4" w:space="0" w:color="D9D9D2"/>
+              <w:right w:val="single" w:sz="4" w:space="0" w:color="D9D9D2"/>
+            </w:tcBorders>
+          </w:tcPr>
+          <w:p>
+            <w:pPr>
+              <w:pStyle w:val="Normal"/>
+              <w:spacing w:lineRule="auto" w:line="268" w:before="0" w:after="0"/>
+              <w:rPr/>
+            </w:pPr>
+            <w:r>
+              <w:rPr>
+                <w:rFonts w:cs="Arial"/>
+                <w:b w:val="false"/>
+                <w:i w:val="false"/>
+                <w:sz w:val="18"/>
+              </w:rPr>
+              <w:t>SSGT to WO2. Likely linked: ELDA Lead Systems (A18010) mandated on the WO course (A1532). Whether ILD LDS Lead Systems is a prerequisite for WO2 carries Dave's question mark; check the promotion-course CDS. Army cannot guarantee an ILD seat, so the course is routinely done before or after the promotion course</w:t>
+            </w:r>
+          </w:p>
+        </w:tc>
+        <w:tc>
+          <w:tcPr>
+            <w:tcW w:w="3628" w:type="dxa"/>
+            <w:tcBorders>
+              <w:top w:val="single" w:sz="4" w:space="0" w:color="D9D9D2"/>
+              <w:left w:val="single" w:sz="4" w:space="0" w:color="D9D9D2"/>
+              <w:bottom w:val="single" w:sz="4" w:space="0" w:color="D9D9D2"/>
+              <w:right w:val="single" w:sz="4" w:space="0" w:color="A89662"/>
+            </w:tcBorders>
+          </w:tcPr>
+          <w:p>
+            <w:pPr>
+              <w:pStyle w:val="Normal"/>
+              <w:spacing w:lineRule="auto" w:line="268" w:before="0" w:after="0"/>
+              <w:rPr/>
+            </w:pPr>
+            <w:r>
+              <w:rPr>
+                <w:rFonts w:cs="Arial"/>
+                <w:b w:val="false"/>
+                <w:i w:val="false"/>
+                <w:sz w:val="18"/>
+              </w:rPr>
+              <w:t>CAPT to MAJ. Self-selected: neither ELDA Lead Systems nor ILD LDS Lead Systems is mandated or policed; those who most need it opt out</w:t>
+            </w:r>
+          </w:p>
+        </w:tc>
+      </w:tr>
+      <w:tr>
+        <w:trPr>
+          <w:cantSplit w:val="true"/>
+        </w:trPr>
+        <w:tc>
+          <w:tcPr>
+            <w:tcW w:w="2040" w:type="dxa"/>
+            <w:tcBorders>
+              <w:top w:val="single" w:sz="4" w:space="0" w:color="D9D9D2"/>
+              <w:left w:val="single" w:sz="4" w:space="0" w:color="A89662"/>
+              <w:bottom w:val="single" w:sz="4" w:space="0" w:color="D9D9D2"/>
+              <w:right w:val="single" w:sz="4" w:space="0" w:color="D9D9D2"/>
+            </w:tcBorders>
+            <w:shd w:color="auto" w:fill="CDD2B7" w:val="clear"/>
+          </w:tcPr>
+          <w:p>
+            <w:pPr>
+              <w:pStyle w:val="Normal"/>
+              <w:spacing w:lineRule="auto" w:line="268" w:before="0" w:after="0"/>
+              <w:rPr/>
+            </w:pPr>
+            <w:r>
+              <w:rPr>
+                <w:rFonts w:cs="Arial"/>
+                <w:b/>
+                <w:i w:val="false"/>
+                <w:color w:val="002516"/>
+                <w:sz w:val="18"/>
+              </w:rPr>
+              <w:t>T4 Lead Systems to Lead Capability</w:t>
+            </w:r>
+          </w:p>
+        </w:tc>
+        <w:tc>
+          <w:tcPr>
+            <w:tcW w:w="3629" w:type="dxa"/>
+            <w:tcBorders>
+              <w:top w:val="single" w:sz="4" w:space="0" w:color="D9D9D2"/>
+              <w:left w:val="single" w:sz="4" w:space="0" w:color="D9D9D2"/>
+              <w:bottom w:val="single" w:sz="4" w:space="0" w:color="D9D9D2"/>
+              <w:right w:val="single" w:sz="4" w:space="0" w:color="D9D9D2"/>
+            </w:tcBorders>
+          </w:tcPr>
+          <w:p>
+            <w:pPr>
+              <w:pStyle w:val="Normal"/>
+              <w:spacing w:lineRule="auto" w:line="268" w:before="0" w:after="0"/>
+              <w:rPr/>
+            </w:pPr>
+            <w:r>
+              <w:rPr>
+                <w:rFonts w:cs="Arial"/>
+                <w:b w:val="false"/>
+                <w:i w:val="false"/>
+                <w:sz w:val="18"/>
+              </w:rPr>
+              <w:t>WO2 to WO1. Expected, high uptake: "pretty sure" not in policy; most attend, subject to an ILD seat. TO CONFIRM</w:t>
+            </w:r>
+          </w:p>
+        </w:tc>
+        <w:tc>
+          <w:tcPr>
+            <w:tcW w:w="3628" w:type="dxa"/>
+            <w:tcBorders>
+              <w:top w:val="single" w:sz="4" w:space="0" w:color="D9D9D2"/>
+              <w:left w:val="single" w:sz="4" w:space="0" w:color="D9D9D2"/>
+              <w:bottom w:val="single" w:sz="4" w:space="0" w:color="D9D9D2"/>
+              <w:right w:val="single" w:sz="4" w:space="0" w:color="A89662"/>
+            </w:tcBorders>
+          </w:tcPr>
+          <w:p>
+            <w:pPr>
+              <w:pStyle w:val="Normal"/>
+              <w:spacing w:lineRule="auto" w:line="268" w:before="0" w:after="0"/>
+              <w:rPr/>
+            </w:pPr>
+            <w:r>
+              <w:rPr>
+                <w:rFonts w:cs="Arial"/>
+                <w:b w:val="false"/>
+                <w:i w:val="false"/>
+                <w:sz w:val="18"/>
+              </w:rPr>
+              <w:t>MAJ to LTCOL. Expected, high uptake: not mandated; the impression is that all complete it. TO CONFIRM</w:t>
+            </w:r>
+          </w:p>
+        </w:tc>
+      </w:tr>
+      <w:tr>
+        <w:trPr>
+          <w:cantSplit w:val="true"/>
+        </w:trPr>
+        <w:tc>
+          <w:tcPr>
+            <w:tcW w:w="2040" w:type="dxa"/>
+            <w:tcBorders>
+              <w:top w:val="single" w:sz="4" w:space="0" w:color="D9D9D2"/>
+              <w:left w:val="single" w:sz="4" w:space="0" w:color="A89662"/>
+              <w:bottom w:val="single" w:sz="4" w:space="0" w:color="D9D9D2"/>
+              <w:right w:val="single" w:sz="4" w:space="0" w:color="D9D9D2"/>
+            </w:tcBorders>
+            <w:shd w:color="auto" w:fill="CDD2B7" w:val="clear"/>
+          </w:tcPr>
+          <w:p>
+            <w:pPr>
+              <w:pStyle w:val="Normal"/>
+              <w:spacing w:lineRule="auto" w:line="268" w:before="0" w:after="0"/>
+              <w:rPr/>
+            </w:pPr>
+            <w:r>
+              <w:rPr>
+                <w:rFonts w:cs="Arial"/>
+                <w:b/>
+                <w:i w:val="false"/>
+                <w:color w:val="002516"/>
+                <w:sz w:val="18"/>
+              </w:rPr>
+              <w:t>T5 Lead Capability to Lead Integrated Capability</w:t>
+            </w:r>
+          </w:p>
+        </w:tc>
+        <w:tc>
+          <w:tcPr>
+            <w:tcW w:w="3629" w:type="dxa"/>
+            <w:tcBorders>
+              <w:top w:val="single" w:sz="4" w:space="0" w:color="D9D9D2"/>
+              <w:left w:val="single" w:sz="4" w:space="0" w:color="D9D9D2"/>
+              <w:bottom w:val="single" w:sz="4" w:space="0" w:color="D9D9D2"/>
+              <w:right w:val="single" w:sz="4" w:space="0" w:color="D9D9D2"/>
+            </w:tcBorders>
+          </w:tcPr>
+          <w:p>
+            <w:pPr>
+              <w:pStyle w:val="Normal"/>
+              <w:spacing w:lineRule="auto" w:line="268" w:before="0" w:after="0"/>
+              <w:rPr/>
+            </w:pPr>
+            <w:r>
+              <w:rPr>
+                <w:rFonts w:cs="Arial"/>
+                <w:b w:val="false"/>
+                <w:i w:val="false"/>
+                <w:sz w:val="18"/>
+              </w:rPr>
+              <w:t>WO1s. ILD pathway: one ELDA week (ALC caving or Navy sailing) and one LDS week in Wellington, both run and funded by ILD; 12 to 16 students; attended without exception</w:t>
+            </w:r>
+          </w:p>
+        </w:tc>
+        <w:tc>
+          <w:tcPr>
+            <w:tcW w:w="3628" w:type="dxa"/>
+            <w:tcBorders>
+              <w:top w:val="single" w:sz="4" w:space="0" w:color="D9D9D2"/>
+              <w:left w:val="single" w:sz="4" w:space="0" w:color="D9D9D2"/>
+              <w:bottom w:val="single" w:sz="4" w:space="0" w:color="D9D9D2"/>
+              <w:right w:val="single" w:sz="4" w:space="0" w:color="A89662"/>
+            </w:tcBorders>
+          </w:tcPr>
+          <w:p>
+            <w:pPr>
+              <w:pStyle w:val="Normal"/>
+              <w:spacing w:lineRule="auto" w:line="268" w:before="0" w:after="0"/>
+              <w:rPr/>
+            </w:pPr>
+            <w:r>
+              <w:rPr>
+                <w:rFonts w:cs="Arial"/>
+                <w:b w:val="false"/>
+                <w:i w:val="false"/>
+                <w:sz w:val="18"/>
+              </w:rPr>
+              <w:t>LTCOL and COL. The same course; attended without exception</w:t>
+            </w:r>
+          </w:p>
+        </w:tc>
+      </w:tr>
+      <w:tr>
+        <w:trPr>
+          <w:cantSplit w:val="true"/>
+        </w:trPr>
+        <w:tc>
+          <w:tcPr>
+            <w:tcW w:w="2040" w:type="dxa"/>
+            <w:tcBorders>
+              <w:top w:val="single" w:sz="4" w:space="0" w:color="D9D9D2"/>
+              <w:left w:val="single" w:sz="4" w:space="0" w:color="A89662"/>
+              <w:bottom w:val="single" w:sz="4" w:space="0" w:color="A89662"/>
+              <w:right w:val="single" w:sz="4" w:space="0" w:color="D9D9D2"/>
+            </w:tcBorders>
+            <w:shd w:color="auto" w:fill="CDD2B7" w:val="clear"/>
+          </w:tcPr>
+          <w:p>
+            <w:pPr>
+              <w:pStyle w:val="Normal"/>
+              <w:spacing w:lineRule="auto" w:line="268" w:before="0" w:after="0"/>
+              <w:rPr/>
+            </w:pPr>
+            <w:r>
+              <w:rPr>
+                <w:rFonts w:cs="Arial"/>
+                <w:b/>
+                <w:i w:val="false"/>
+                <w:color w:val="002516"/>
+                <w:sz w:val="18"/>
+              </w:rPr>
+              <w:t>T6 Lead Integrated Capability to Lead Organisation</w:t>
+            </w:r>
+          </w:p>
+        </w:tc>
+        <w:tc>
+          <w:tcPr>
+            <w:tcW w:w="3629" w:type="dxa"/>
+            <w:tcBorders>
+              <w:top w:val="single" w:sz="4" w:space="0" w:color="D9D9D2"/>
+              <w:left w:val="single" w:sz="4" w:space="0" w:color="D9D9D2"/>
+              <w:bottom w:val="single" w:sz="4" w:space="0" w:color="A89662"/>
+              <w:right w:val="single" w:sz="4" w:space="0" w:color="D9D9D2"/>
+            </w:tcBorders>
+          </w:tcPr>
+          <w:p>
+            <w:pPr>
+              <w:pStyle w:val="Normal"/>
+              <w:spacing w:lineRule="auto" w:line="268" w:before="0" w:after="0"/>
+              <w:rPr/>
+            </w:pPr>
+            <w:r>
+              <w:rPr>
+                <w:rFonts w:cs="Arial"/>
+                <w:b w:val="false"/>
+                <w:i w:val="false"/>
+                <w:sz w:val="18"/>
+              </w:rPr>
+              <w:t>Senior WO1s considered for the senior appointments. LDS Lead Organisation with an ELDA component; all complete it well before they need to</w:t>
+            </w:r>
+          </w:p>
+        </w:tc>
+        <w:tc>
+          <w:tcPr>
+            <w:tcW w:w="3628" w:type="dxa"/>
+            <w:tcBorders>
+              <w:top w:val="single" w:sz="4" w:space="0" w:color="D9D9D2"/>
+              <w:left w:val="single" w:sz="4" w:space="0" w:color="D9D9D2"/>
+              <w:bottom w:val="single" w:sz="4" w:space="0" w:color="A89662"/>
+              <w:right w:val="single" w:sz="4" w:space="0" w:color="A89662"/>
+            </w:tcBorders>
+          </w:tcPr>
+          <w:p>
+            <w:pPr>
+              <w:pStyle w:val="Normal"/>
+              <w:spacing w:lineRule="auto" w:line="268" w:before="0" w:after="0"/>
+              <w:rPr/>
+            </w:pPr>
+            <w:r>
+              <w:rPr>
+                <w:rFonts w:cs="Arial"/>
+                <w:b w:val="false"/>
+                <w:i w:val="false"/>
+                <w:sz w:val="18"/>
+              </w:rPr>
+              <w:t>COL and BRIG. The same course; all complete it well before required</w:t>
+            </w:r>
+          </w:p>
+        </w:tc>
+      </w:tr>
+    </w:tbl>
+    <w:p>
+      <w:pPr>
+        <w:pStyle w:val="Normal"/>
+        <w:spacing w:before="0" w:after="120"/>
+        <w:rPr/>
+      </w:pPr>
+      <w:r>
+        <w:rPr/>
+      </w:r>
+    </w:p>
+    <w:p>
+      <w:pPr>
+        <w:pStyle w:val="Normal"/>
+        <w:rPr/>
+      </w:pPr>
+      <w:r>
+        <w:rPr>
+          <w:rFonts w:cs="Arial"/>
+          <w:b w:val="false"/>
+          <w:i w:val="false"/>
+        </w:rPr>
+        <w:t>Two structural facts from the meeting shape the reading of the table.</w:t>
+      </w:r>
+    </w:p>
+    <w:p>
+      <w:pPr>
+        <w:pStyle w:val="Normal"/>
+        <w:tabs>
+          <w:tab w:val="clear" w:pos="720"/>
+          <w:tab w:val="left" w:pos="397" w:leader="none"/>
+        </w:tabs>
+        <w:spacing w:before="60" w:after="40"/>
+        <w:ind w:hanging="397" w:left="397"/>
+        <w:rPr/>
+      </w:pPr>
+      <w:r>
+        <w:rPr>
+          <w:rFonts w:cs="Arial"/>
+          <w:color w:val="000000"/>
+        </w:rPr>
+        <w:t>1.</w:t>
+        <w:tab/>
+      </w:r>
+      <w:r>
+        <w:rPr>
+          <w:rFonts w:cs="Arial"/>
+          <w:b/>
+          <w:i w:val="false"/>
+        </w:rPr>
+        <w:t>The 2012 division of delivery.</w:t>
+      </w:r>
+      <w:r>
+        <w:rPr>
+          <w:rFonts w:cs="Arial"/>
+          <w:b w:val="false"/>
+          <w:i w:val="false"/>
+        </w:rPr>
+        <w:t xml:space="preserve"> Single-Service providers train Lead Self to Lead Leaders, which covers most of the organisation. ILD trains Lead Systems and above for all three Services, and Army retains the ELDA function at those levels. Army therefore cannot guarantee an ILD seat, which is why LDS Lead Systems sits outside the WO promotion course and why a mandate above T2 is harder to enforce on either continuum.</w:t>
+      </w:r>
+    </w:p>
+    <w:p>
+      <w:pPr>
+        <w:pStyle w:val="Normal"/>
+        <w:tabs>
+          <w:tab w:val="clear" w:pos="720"/>
+          <w:tab w:val="left" w:pos="397" w:leader="none"/>
+        </w:tabs>
+        <w:spacing w:before="60" w:after="40"/>
+        <w:ind w:hanging="397" w:left="397"/>
+        <w:rPr/>
+      </w:pPr>
+      <w:r>
+        <w:rPr>
+          <w:rFonts w:cs="Arial"/>
+          <w:color w:val="000000"/>
+        </w:rPr>
+        <w:t>2.</w:t>
+        <w:tab/>
+      </w:r>
+      <w:r>
+        <w:rPr>
+          <w:rFonts w:cs="Arial"/>
+          <w:b/>
+          <w:i w:val="false"/>
+        </w:rPr>
+        <w:t>Uptake above the middle is not evidence of a mandate.</w:t>
+      </w:r>
+      <w:r>
+        <w:rPr>
+          <w:rFonts w:cs="Arial"/>
+          <w:b w:val="false"/>
+          <w:i w:val="false"/>
+        </w:rPr>
+        <w:t xml:space="preserve"> At Lead Capability and above people generally complete the development, but the meeting did not establish that policy requires it. Those cells stay at "expected" until the policy check is done.</w:t>
+      </w:r>
+    </w:p>
+    <w:p>
+      <w:pPr>
+        <w:pStyle w:val="Normal"/>
+        <w:rPr/>
+      </w:pPr>
+      <w:r>
+        <w:rPr>
+          <w:rFonts w:cs="Arial"/>
+          <w:b w:val="false"/>
+          <w:i w:val="false"/>
+        </w:rPr>
+        <w:t>The facts still required are the same three for every transition on each side, and are listed in the accompanying register:</w:t>
+      </w:r>
+    </w:p>
+    <w:p>
+      <w:pPr>
+        <w:pStyle w:val="Normal"/>
+        <w:tabs>
+          <w:tab w:val="clear" w:pos="720"/>
+          <w:tab w:val="left" w:pos="397" w:leader="none"/>
+        </w:tabs>
+        <w:spacing w:before="60" w:after="40"/>
+        <w:ind w:hanging="397" w:left="397"/>
+        <w:rPr/>
+      </w:pPr>
+      <w:r>
+        <w:rPr>
+          <w:rFonts w:cs="Arial"/>
+          <w:color w:val="000000"/>
+        </w:rPr>
+        <w:t>1.</w:t>
+        <w:tab/>
+      </w:r>
+      <w:r>
+        <w:rPr>
+          <w:rFonts w:cs="Arial"/>
+          <w:b/>
+          <w:i w:val="false"/>
+        </w:rPr>
+        <w:t>Promotion point.</w:t>
+      </w:r>
+      <w:r>
+        <w:rPr>
+          <w:rFonts w:cs="Arial"/>
+          <w:b w:val="false"/>
+          <w:i w:val="false"/>
+        </w:rPr>
+        <w:t xml:space="preserve"> The authoritative Army promotion or career point that corresponds to the transition.</w:t>
+      </w:r>
+    </w:p>
+    <w:p>
+      <w:pPr>
+        <w:pStyle w:val="Normal"/>
+        <w:tabs>
+          <w:tab w:val="clear" w:pos="720"/>
+          <w:tab w:val="left" w:pos="397" w:leader="none"/>
+        </w:tabs>
+        <w:spacing w:before="60" w:after="40"/>
+        <w:ind w:hanging="397" w:left="397"/>
+        <w:rPr/>
+      </w:pPr>
+      <w:r>
+        <w:rPr>
+          <w:rFonts w:cs="Arial"/>
+          <w:color w:val="000000"/>
+        </w:rPr>
+        <w:t>2.</w:t>
+        <w:tab/>
+      </w:r>
+      <w:r>
+        <w:rPr>
+          <w:rFonts w:cs="Arial"/>
+          <w:b/>
+          <w:i w:val="false"/>
+        </w:rPr>
+        <w:t>Development intervention.</w:t>
+      </w:r>
+      <w:r>
+        <w:rPr>
+          <w:rFonts w:cs="Arial"/>
+          <w:b w:val="false"/>
+          <w:i w:val="false"/>
+        </w:rPr>
+        <w:t xml:space="preserve"> The course or programme that develops the individual for that transition, with its SOLO code.</w:t>
+      </w:r>
+    </w:p>
+    <w:p>
+      <w:pPr>
+        <w:pStyle w:val="Normal"/>
+        <w:tabs>
+          <w:tab w:val="clear" w:pos="720"/>
+          <w:tab w:val="left" w:pos="397" w:leader="none"/>
+        </w:tabs>
+        <w:spacing w:before="60" w:after="40"/>
+        <w:ind w:hanging="397" w:left="397"/>
+        <w:rPr/>
+      </w:pPr>
+      <w:r>
+        <w:rPr>
+          <w:rFonts w:cs="Arial"/>
+          <w:color w:val="000000"/>
+        </w:rPr>
+        <w:t>3.</w:t>
+        <w:tab/>
+      </w:r>
+      <w:r>
+        <w:rPr>
+          <w:rFonts w:cs="Arial"/>
+          <w:b/>
+          <w:i w:val="false"/>
+        </w:rPr>
+        <w:t>Career linkage.</w:t>
+      </w:r>
+      <w:r>
+        <w:rPr>
+          <w:rFonts w:cs="Arial"/>
+          <w:b w:val="false"/>
+          <w:i w:val="false"/>
+        </w:rPr>
+        <w:t xml:space="preserve"> Where the link sits on the scale in section 3, confirmed against promotion policy or the promotion-course data sheet. For the officer side at T2 to T4 this is a check of policy against what the meeting stated, and it is the remaining hard work: the story the product tells is now settled.</w:t>
+      </w:r>
+    </w:p>
+    <w:p>
+      <w:pPr>
+        <w:pStyle w:val="Heading1"/>
+        <w:rPr/>
+      </w:pPr>
+      <w:r>
+        <w:rPr>
+          <w:rFonts w:cs="Arial"/>
+          <w:b/>
+          <w:i w:val="false"/>
+          <w:color w:val="002516"/>
+          <w:sz w:val="25"/>
+        </w:rPr>
+        <w:t>6. How It Arose, and Tone</w:t>
+      </w:r>
+    </w:p>
+    <w:p>
+      <w:pPr>
+        <w:pStyle w:val="Normal"/>
+        <w:rPr/>
+      </w:pPr>
+      <w:r>
+        <w:rPr>
+          <w:rFonts w:cs="Arial"/>
+          <w:b w:val="false"/>
+          <w:i w:val="false"/>
+        </w:rPr>
+        <w:t>COMDT does not want an accusatory paper, and the meeting gives the history that makes one unnecessary. Intent and senior buy-in existed: AITC agreed in principle that officers should complete the development. Lead Leaders was attached to Grade 2 and 3 coursing for a two-year trial, and the additional time away from units was judged untenable. A distributed model was then preferred, leaving officers to schedule the development within their careers. Later restructuring and course redesigns proceeded without ACS at the table, so no integrated solution emerged. The Post Commissioning Programme got every junior officer through Lead Leaders, but before unit experience, which the meeting judged the wrong time.</w:t>
+      </w:r>
+    </w:p>
+    <w:p>
+      <w:pPr>
+        <w:pStyle w:val="Normal"/>
+        <w:rPr/>
+      </w:pPr>
+      <w:r>
+        <w:rPr>
+          <w:rFonts w:cs="Arial"/>
+          <w:b w:val="false"/>
+          <w:i w:val="false"/>
+        </w:rPr>
+        <w:t>Dave's assessment near the end was that this looks like a scheduling and implementation problem under organisational tempo rather than an intentional decision to develop officers differently: when development is not formally required, it is what gets displaced. That may be the answer to COMDT's question. It is not put forward as ALC's finding. Page 2 carries it as context, marked as the assessment offered at the meeting, and leaves AITC to answer the institutional question. Both branches of the closing question are given equal weight, and no recommendation is attached.</w:t>
+      </w:r>
+    </w:p>
+    <w:p>
+      <w:pPr>
+        <w:pStyle w:val="Heading1"/>
+        <w:rPr/>
+      </w:pPr>
+      <w:r>
+        <w:rPr>
+          <w:rFonts w:cs="Arial"/>
+          <w:b/>
+          <w:i w:val="false"/>
+          <w:color w:val="002516"/>
+          <w:sz w:val="25"/>
+        </w:rPr>
+        <w:t>7. What Has Been Withdrawn</w:t>
+      </w:r>
+    </w:p>
+    <w:p>
+      <w:pPr>
+        <w:pStyle w:val="Normal"/>
+        <w:rPr/>
+      </w:pPr>
+      <w:r>
+        <w:rPr>
+          <w:rFonts w:cs="Arial"/>
+          <w:b w:val="false"/>
+          <w:i w:val="false"/>
+        </w:rPr>
+        <w:t>The six-category matrix (rank, appointment, development, career linkage, timing, assurance), the gap taxonomy, and the seven-page sequence remain in the repository history as analytical scaffolding. They are not part of the briefing product. The binary MANDATED? boxes of the first two-page draft are replaced by the linkage scale.</w:t>
+      </w:r>
+    </w:p>
+    <w:p>
+      <w:pPr>
+        <w:pStyle w:val="Heading1"/>
+        <w:rPr/>
+      </w:pPr>
+      <w:r>
+        <w:rPr>
+          <w:rFonts w:cs="Arial"/>
+          <w:b/>
+          <w:i w:val="false"/>
+          <w:color w:val="002516"/>
+          <w:sz w:val="25"/>
+        </w:rPr>
+        <w:t>8. Actions From the 9 September Meeting</w:t>
+      </w:r>
+    </w:p>
+    <w:tbl>
+      <w:tblPr>
+        <w:tblW w:w="9297" w:type="dxa"/>
+        <w:jc w:val="left"/>
+        <w:tblInd w:w="-8" w:type="dxa"/>
+        <w:tblLayout w:type="fixed"/>
+        <w:tblCellMar>
+          <w:top w:w="60" w:type="dxa"/>
+          <w:left w:w="100" w:type="dxa"/>
+          <w:bottom w:w="60" w:type="dxa"/>
+          <w:right w:w="100" w:type="dxa"/>
+        </w:tblCellMar>
+        <w:tblLook w:val="04a0" w:noHBand="0" w:noVBand="1" w:firstColumn="1" w:lastRow="0" w:lastColumn="0" w:firstRow="1"/>
+      </w:tblPr>
+      <w:tblGrid>
+        <w:gridCol w:w="2040"/>
+        <w:gridCol w:w="3629"/>
+        <w:gridCol w:w="3628"/>
+      </w:tblGrid>
+      <w:tr>
+        <w:trPr>
+          <w:cantSplit w:val="true"/>
+        </w:trPr>
+        <w:tc>
+          <w:tcPr>
+            <w:tcW w:w="2040" w:type="dxa"/>
+            <w:tcBorders>
+              <w:top w:val="single" w:sz="4" w:space="0" w:color="A89662"/>
+              <w:left w:val="single" w:sz="4" w:space="0" w:color="A89662"/>
+              <w:bottom w:val="single" w:sz="4" w:space="0" w:color="D9D9D2"/>
+              <w:right w:val="single" w:sz="4" w:space="0" w:color="D9D9D2"/>
+            </w:tcBorders>
+            <w:shd w:color="auto" w:fill="002516" w:val="clear"/>
+          </w:tcPr>
+          <w:p>
+            <w:pPr>
+              <w:pStyle w:val="Normal"/>
+              <w:spacing w:lineRule="auto" w:line="268" w:before="0" w:after="0"/>
+              <w:rPr/>
+            </w:pPr>
+            <w:r>
+              <w:rPr>
+                <w:rFonts w:cs="Arial"/>
+                <w:b/>
+                <w:i w:val="false"/>
+                <w:color w:val="FFFFFF"/>
+                <w:sz w:val="18"/>
+              </w:rPr>
+              <w:t>Action</w:t>
+            </w:r>
+          </w:p>
+        </w:tc>
+        <w:tc>
+          <w:tcPr>
+            <w:tcW w:w="3629" w:type="dxa"/>
+            <w:tcBorders>
+              <w:top w:val="single" w:sz="4" w:space="0" w:color="A89662"/>
+              <w:left w:val="single" w:sz="4" w:space="0" w:color="D9D9D2"/>
+              <w:bottom w:val="single" w:sz="4" w:space="0" w:color="D9D9D2"/>
+              <w:right w:val="single" w:sz="4" w:space="0" w:color="D9D9D2"/>
+            </w:tcBorders>
+            <w:shd w:color="auto" w:fill="002516" w:val="clear"/>
+          </w:tcPr>
+          <w:p>
+            <w:pPr>
+              <w:pStyle w:val="Normal"/>
+              <w:spacing w:lineRule="auto" w:line="268" w:before="0" w:after="0"/>
+              <w:rPr/>
+            </w:pPr>
+            <w:r>
+              <w:rPr>
+                <w:rFonts w:cs="Arial"/>
+                <w:b/>
+                <w:i w:val="false"/>
+                <w:color w:val="FFFFFF"/>
+                <w:sz w:val="18"/>
+              </w:rPr>
+              <w:t>Owner</w:t>
+            </w:r>
+          </w:p>
+        </w:tc>
+        <w:tc>
+          <w:tcPr>
+            <w:tcW w:w="3628" w:type="dxa"/>
+            <w:tcBorders>
+              <w:top w:val="single" w:sz="4" w:space="0" w:color="A89662"/>
+              <w:left w:val="single" w:sz="4" w:space="0" w:color="D9D9D2"/>
+              <w:bottom w:val="single" w:sz="4" w:space="0" w:color="D9D9D2"/>
+              <w:right w:val="single" w:sz="4" w:space="0" w:color="A89662"/>
+            </w:tcBorders>
+            <w:shd w:color="auto" w:fill="002516" w:val="clear"/>
+          </w:tcPr>
+          <w:p>
+            <w:pPr>
+              <w:pStyle w:val="Normal"/>
+              <w:spacing w:lineRule="auto" w:line="268" w:before="0" w:after="0"/>
+              <w:rPr/>
+            </w:pPr>
+            <w:r>
+              <w:rPr>
+                <w:rFonts w:cs="Arial"/>
+                <w:b/>
+                <w:i w:val="false"/>
+                <w:color w:val="FFFFFF"/>
+                <w:sz w:val="18"/>
+              </w:rPr>
+              <w:t>Where it lands in this product</w:t>
+            </w:r>
+          </w:p>
+        </w:tc>
+      </w:tr>
+      <w:tr>
+        <w:trPr>
+          <w:cantSplit w:val="true"/>
+        </w:trPr>
+        <w:tc>
+          <w:tcPr>
+            <w:tcW w:w="2040" w:type="dxa"/>
+            <w:tcBorders>
+              <w:top w:val="single" w:sz="4" w:space="0" w:color="D9D9D2"/>
+              <w:left w:val="single" w:sz="4" w:space="0" w:color="A89662"/>
+              <w:bottom w:val="single" w:sz="4" w:space="0" w:color="D9D9D2"/>
+              <w:right w:val="single" w:sz="4" w:space="0" w:color="D9D9D2"/>
+            </w:tcBorders>
+            <w:shd w:color="auto" w:fill="CDD2B7" w:val="clear"/>
+          </w:tcPr>
+          <w:p>
+            <w:pPr>
+              <w:pStyle w:val="Normal"/>
+              <w:spacing w:lineRule="auto" w:line="268" w:before="0" w:after="0"/>
+              <w:rPr/>
+            </w:pPr>
+            <w:r>
+              <w:rPr>
+                <w:rFonts w:cs="Arial"/>
+                <w:b/>
+                <w:i w:val="false"/>
+                <w:color w:val="002516"/>
+                <w:sz w:val="18"/>
+              </w:rPr>
+              <w:t>Verify whether the ILD LDS Lead Systems course is a prerequisite in the promotion-course data sheet for SSGT to WO2</w:t>
+            </w:r>
+          </w:p>
+        </w:tc>
+        <w:tc>
+          <w:tcPr>
+            <w:tcW w:w="3629" w:type="dxa"/>
+            <w:tcBorders>
+              <w:top w:val="single" w:sz="4" w:space="0" w:color="D9D9D2"/>
+              <w:left w:val="single" w:sz="4" w:space="0" w:color="D9D9D2"/>
+              <w:bottom w:val="single" w:sz="4" w:space="0" w:color="D9D9D2"/>
+              <w:right w:val="single" w:sz="4" w:space="0" w:color="D9D9D2"/>
+            </w:tcBorders>
+          </w:tcPr>
+          <w:p>
+            <w:pPr>
+              <w:pStyle w:val="Normal"/>
+              <w:spacing w:lineRule="auto" w:line="268" w:before="0" w:after="0"/>
+              <w:rPr/>
+            </w:pPr>
+            <w:r>
+              <w:rPr>
+                <w:rFonts w:cs="Arial"/>
+                <w:b w:val="false"/>
+                <w:i w:val="false"/>
+                <w:sz w:val="18"/>
+              </w:rPr>
+              <w:t>Dave</w:t>
+            </w:r>
+          </w:p>
+        </w:tc>
+        <w:tc>
+          <w:tcPr>
+            <w:tcW w:w="3628" w:type="dxa"/>
+            <w:tcBorders>
+              <w:top w:val="single" w:sz="4" w:space="0" w:color="D9D9D2"/>
+              <w:left w:val="single" w:sz="4" w:space="0" w:color="D9D9D2"/>
+              <w:bottom w:val="single" w:sz="4" w:space="0" w:color="D9D9D2"/>
+              <w:right w:val="single" w:sz="4" w:space="0" w:color="A89662"/>
+            </w:tcBorders>
+          </w:tcPr>
+          <w:p>
+            <w:pPr>
+              <w:pStyle w:val="Normal"/>
+              <w:spacing w:lineRule="auto" w:line="268" w:before="0" w:after="0"/>
+              <w:rPr/>
+            </w:pPr>
+            <w:r>
+              <w:rPr>
+                <w:rFonts w:cs="Arial"/>
+                <w:b w:val="false"/>
+                <w:i w:val="false"/>
+                <w:sz w:val="18"/>
+              </w:rPr>
+              <w:t>Page 1, soldier T3; register row T3-R-LINK</w:t>
+            </w:r>
+          </w:p>
+        </w:tc>
+      </w:tr>
+      <w:tr>
+        <w:trPr>
+          <w:cantSplit w:val="true"/>
+        </w:trPr>
+        <w:tc>
+          <w:tcPr>
+            <w:tcW w:w="2040" w:type="dxa"/>
+            <w:tcBorders>
+              <w:top w:val="single" w:sz="4" w:space="0" w:color="D9D9D2"/>
+              <w:left w:val="single" w:sz="4" w:space="0" w:color="A89662"/>
+              <w:bottom w:val="single" w:sz="4" w:space="0" w:color="D9D9D2"/>
+              <w:right w:val="single" w:sz="4" w:space="0" w:color="D9D9D2"/>
+            </w:tcBorders>
+            <w:shd w:color="auto" w:fill="CDD2B7" w:val="clear"/>
+          </w:tcPr>
+          <w:p>
+            <w:pPr>
+              <w:pStyle w:val="Normal"/>
+              <w:spacing w:lineRule="auto" w:line="268" w:before="0" w:after="0"/>
+              <w:rPr/>
+            </w:pPr>
+            <w:r>
+              <w:rPr>
+                <w:rFonts w:cs="Arial"/>
+                <w:b/>
+                <w:i w:val="false"/>
+                <w:color w:val="002516"/>
+                <w:sz w:val="18"/>
+              </w:rPr>
+              <w:t>Check officer promotion requirements in policy for leadership training mandates at each rank</w:t>
+            </w:r>
+          </w:p>
+        </w:tc>
+        <w:tc>
+          <w:tcPr>
+            <w:tcW w:w="3629" w:type="dxa"/>
+            <w:tcBorders>
+              <w:top w:val="single" w:sz="4" w:space="0" w:color="D9D9D2"/>
+              <w:left w:val="single" w:sz="4" w:space="0" w:color="D9D9D2"/>
+              <w:bottom w:val="single" w:sz="4" w:space="0" w:color="D9D9D2"/>
+              <w:right w:val="single" w:sz="4" w:space="0" w:color="D9D9D2"/>
+            </w:tcBorders>
+          </w:tcPr>
+          <w:p>
+            <w:pPr>
+              <w:pStyle w:val="Normal"/>
+              <w:spacing w:lineRule="auto" w:line="268" w:before="0" w:after="0"/>
+              <w:rPr/>
+            </w:pPr>
+            <w:r>
+              <w:rPr>
+                <w:rFonts w:cs="Arial"/>
+                <w:b w:val="false"/>
+                <w:i w:val="false"/>
+                <w:sz w:val="18"/>
+              </w:rPr>
+              <w:t>Team</w:t>
+            </w:r>
+          </w:p>
+        </w:tc>
+        <w:tc>
+          <w:tcPr>
+            <w:tcW w:w="3628" w:type="dxa"/>
+            <w:tcBorders>
+              <w:top w:val="single" w:sz="4" w:space="0" w:color="D9D9D2"/>
+              <w:left w:val="single" w:sz="4" w:space="0" w:color="D9D9D2"/>
+              <w:bottom w:val="single" w:sz="4" w:space="0" w:color="D9D9D2"/>
+              <w:right w:val="single" w:sz="4" w:space="0" w:color="A89662"/>
+            </w:tcBorders>
+          </w:tcPr>
+          <w:p>
+            <w:pPr>
+              <w:pStyle w:val="Normal"/>
+              <w:spacing w:lineRule="auto" w:line="268" w:before="0" w:after="0"/>
+              <w:rPr/>
+            </w:pPr>
+            <w:r>
+              <w:rPr>
+                <w:rFonts w:cs="Arial"/>
+                <w:b w:val="false"/>
+                <w:i w:val="false"/>
+                <w:sz w:val="18"/>
+              </w:rPr>
+              <w:t>Page 1, officer T2 to T4; register rows T2-O-LINK to T4-O-LINK, and X1</w:t>
+            </w:r>
+          </w:p>
+        </w:tc>
+      </w:tr>
+      <w:tr>
+        <w:trPr>
+          <w:cantSplit w:val="true"/>
+        </w:trPr>
+        <w:tc>
+          <w:tcPr>
+            <w:tcW w:w="2040" w:type="dxa"/>
+            <w:tcBorders>
+              <w:top w:val="single" w:sz="4" w:space="0" w:color="D9D9D2"/>
+              <w:left w:val="single" w:sz="4" w:space="0" w:color="A89662"/>
+              <w:bottom w:val="single" w:sz="4" w:space="0" w:color="D9D9D2"/>
+              <w:right w:val="single" w:sz="4" w:space="0" w:color="D9D9D2"/>
+            </w:tcBorders>
+            <w:shd w:color="auto" w:fill="CDD2B7" w:val="clear"/>
+          </w:tcPr>
+          <w:p>
+            <w:pPr>
+              <w:pStyle w:val="Normal"/>
+              <w:spacing w:lineRule="auto" w:line="268" w:before="0" w:after="0"/>
+              <w:rPr/>
+            </w:pPr>
+            <w:r>
+              <w:rPr>
+                <w:rFonts w:cs="Arial"/>
+                <w:b/>
+                <w:i w:val="false"/>
+                <w:color w:val="002516"/>
+                <w:sz w:val="18"/>
+              </w:rPr>
               <w:t>Develop a visual mapping of the current versus desired framework, highlighting discrepancies and critical points</w:t>
             </w:r>
           </w:p>
@@ -2580,7 +3235,7 @@
                 <w:i w:val="false"/>
                 <w:sz w:val="18"/>
               </w:rPr>
-              <w:t>Pages 1 and 3</w:t>
+              <w:t>Pages 1 to 3</w:t>
             </w:r>
           </w:p>
         </w:tc>
@@ -2863,7 +3518,7 @@
         <w:sz w:val="17"/>
         <w:rFonts w:cs="Arial"/>
       </w:rPr>
-      <w:t>5</w:t>
+      <w:t>6</w:t>
     </w:r>
     <w:r>
       <w:rPr>
@@ -2906,7 +3561,7 @@
         <w:sz w:val="17"/>
         <w:rFonts w:cs="Arial"/>
       </w:rPr>
-      <w:t>5</w:t>
+      <w:t>6</w:t>
     </w:r>
     <w:r>
       <w:rPr>
@@ -2987,7 +3642,7 @@
         <w:sz w:val="17"/>
         <w:rFonts w:cs="Arial"/>
       </w:rPr>
-      <w:t>5</w:t>
+      <w:t>6</w:t>
     </w:r>
     <w:r>
       <w:rPr>
@@ -3030,7 +3685,7 @@
         <w:sz w:val="17"/>
         <w:rFonts w:cs="Arial"/>
       </w:rPr>
-      <w:t>5</w:t>
+      <w:t>6</w:t>
     </w:r>
     <w:r>
       <w:rPr>

</xml_diff>